<commit_message>
proposal finish and algos start
</commit_message>
<xml_diff>
--- a/Task_1/Task1_DesignDocs.docx
+++ b/Task_1/Task1_DesignDocs.docx
@@ -524,25 +524,6 @@
     <w:p>
       <w:pPr>
         <w:rPr>
-          <w:color w:val="4472C4" w:themeColor="accent1"/>
-          <w:sz w:val="32"/>
-          <w:szCs w:val="32"/>
-          <w14:shadow w14:blurRad="38100" w14:dist="25400" w14:dir="5400000" w14:sx="100000" w14:sy="100000" w14:kx="0" w14:ky="0" w14:algn="ctr">
-            <w14:srgbClr w14:val="6E747A">
-              <w14:alpha w14:val="57000"/>
-            </w14:srgbClr>
-          </w14:shadow>
-          <w14:textOutline w14:w="0" w14:cap="flat" w14:cmpd="sng" w14:algn="ctr">
-            <w14:noFill/>
-            <w14:prstDash w14:val="solid"/>
-            <w14:round/>
-          </w14:textOutline>
-        </w:rPr>
-      </w:pPr>
-    </w:p>
-    <w:p>
-      <w:pPr>
-        <w:rPr>
           <w14:shadow w14:blurRad="38100" w14:dist="25400" w14:dir="5400000" w14:sx="100000" w14:sy="100000" w14:kx="0" w14:ky="0" w14:algn="ctr">
             <w14:srgbClr w14:val="6E747A">
               <w14:alpha w14:val="57000"/>
@@ -1465,7 +1446,6 @@
                   <w14:round/>
                 </w14:textOutline>
               </w:rPr>
-              <w:lastRenderedPageBreak/>
               <w:t>password</w:t>
             </w:r>
           </w:p>
@@ -1693,6 +1673,7 @@
             <w14:round/>
           </w14:textOutline>
         </w:rPr>
+        <w:lastRenderedPageBreak/>
         <w:t>Booking</w:t>
       </w:r>
       <w:r>
@@ -2092,7 +2073,7 @@
                   <w14:round/>
                 </w14:textOutline>
               </w:rPr>
-              <w:t>10000</w:t>
+              <w:t>N/A</w:t>
             </w:r>
           </w:p>
         </w:tc>
@@ -2277,7 +2258,7 @@
                   <w14:round/>
                 </w14:textOutline>
               </w:rPr>
-              <w:t>10000</w:t>
+              <w:t>N/A</w:t>
             </w:r>
           </w:p>
         </w:tc>
@@ -3255,37 +3236,7 @@
                   <w14:round/>
                 </w14:textOutline>
               </w:rPr>
-              <w:t xml:space="preserve">How many </w:t>
-            </w:r>
-            <w:r>
-              <w:rPr>
-                <w14:shadow w14:blurRad="38100" w14:dist="25400" w14:dir="5400000" w14:sx="100000" w14:sy="100000" w14:kx="0" w14:ky="0" w14:algn="ctr">
-                  <w14:srgbClr w14:val="6E747A">
-                    <w14:alpha w14:val="57000"/>
-                  </w14:srgbClr>
-                </w14:shadow>
-                <w14:textOutline w14:w="0" w14:cap="flat" w14:cmpd="sng" w14:algn="ctr">
-                  <w14:noFill/>
-                  <w14:prstDash w14:val="solid"/>
-                  <w14:round/>
-                </w14:textOutline>
-              </w:rPr>
-              <w:t>adults</w:t>
-            </w:r>
-            <w:r>
-              <w:rPr>
-                <w14:shadow w14:blurRad="38100" w14:dist="25400" w14:dir="5400000" w14:sx="100000" w14:sy="100000" w14:kx="0" w14:ky="0" w14:algn="ctr">
-                  <w14:srgbClr w14:val="6E747A">
-                    <w14:alpha w14:val="57000"/>
-                  </w14:srgbClr>
-                </w14:shadow>
-                <w14:textOutline w14:w="0" w14:cap="flat" w14:cmpd="sng" w14:algn="ctr">
-                  <w14:noFill/>
-                  <w14:prstDash w14:val="solid"/>
-                  <w14:round/>
-                </w14:textOutline>
-              </w:rPr>
-              <w:t xml:space="preserve"> will be visiting and booking for hotel</w:t>
+              <w:t>How many adults will be visiting and booking for hotel</w:t>
             </w:r>
           </w:p>
         </w:tc>
@@ -3708,14 +3659,460 @@
           </w14:textOutline>
         </w:rPr>
       </w:pPr>
+      <w:r>
+        <w:rPr>
+          <w14:shadow w14:blurRad="38100" w14:dist="25400" w14:dir="5400000" w14:sx="100000" w14:sy="100000" w14:kx="0" w14:ky="0" w14:algn="ctr">
+            <w14:srgbClr w14:val="6E747A">
+              <w14:alpha w14:val="57000"/>
+            </w14:srgbClr>
+          </w14:shadow>
+          <w14:textOutline w14:w="0" w14:cap="flat" w14:cmpd="sng" w14:algn="ctr">
+            <w14:noFill/>
+            <w14:prstDash w14:val="solid"/>
+            <w14:round/>
+          </w14:textOutline>
+        </w:rPr>
+        <w:t>Data flow diagram</w:t>
+      </w:r>
+    </w:p>
+    <w:p>
+      <w:pPr>
+        <w:rPr>
+          <w14:shadow w14:blurRad="38100" w14:dist="25400" w14:dir="5400000" w14:sx="100000" w14:sy="100000" w14:kx="0" w14:ky="0" w14:algn="ctr">
+            <w14:srgbClr w14:val="6E747A">
+              <w14:alpha w14:val="57000"/>
+            </w14:srgbClr>
+          </w14:shadow>
+          <w14:textOutline w14:w="0" w14:cap="flat" w14:cmpd="sng" w14:algn="ctr">
+            <w14:noFill/>
+            <w14:prstDash w14:val="solid"/>
+            <w14:round/>
+          </w14:textOutline>
+        </w:rPr>
+      </w:pPr>
+    </w:p>
+    <w:p>
+      <w:pPr>
+        <w:rPr>
+          <w14:shadow w14:blurRad="38100" w14:dist="25400" w14:dir="5400000" w14:sx="100000" w14:sy="100000" w14:kx="0" w14:ky="0" w14:algn="ctr">
+            <w14:srgbClr w14:val="6E747A">
+              <w14:alpha w14:val="57000"/>
+            </w14:srgbClr>
+          </w14:shadow>
+          <w14:textOutline w14:w="0" w14:cap="flat" w14:cmpd="sng" w14:algn="ctr">
+            <w14:noFill/>
+            <w14:prstDash w14:val="solid"/>
+            <w14:round/>
+          </w14:textOutline>
+        </w:rPr>
+      </w:pPr>
+      <w:r>
+        <w:rPr>
+          <w14:shadow w14:blurRad="38100" w14:dist="25400" w14:dir="5400000" w14:sx="100000" w14:sy="100000" w14:kx="0" w14:ky="0" w14:algn="ctr">
+            <w14:srgbClr w14:val="6E747A">
+              <w14:alpha w14:val="57000"/>
+            </w14:srgbClr>
+          </w14:shadow>
+          <w14:textOutline w14:w="0" w14:cap="flat" w14:cmpd="sng" w14:algn="ctr">
+            <w14:noFill/>
+            <w14:prstDash w14:val="solid"/>
+            <w14:round/>
+          </w14:textOutline>
+        </w:rPr>
+        <w:lastRenderedPageBreak/>
+        <w:drawing>
+          <wp:inline distT="0" distB="0" distL="0" distR="0" wp14:anchorId="01991691" wp14:editId="7C685BC3">
+            <wp:extent cx="5731510" cy="5731510"/>
+            <wp:effectExtent l="0" t="0" r="2540" b="2540"/>
+            <wp:docPr id="3" name="Picture 3"/>
+            <wp:cNvGraphicFramePr>
+              <a:graphicFrameLocks xmlns:a="http://schemas.openxmlformats.org/drawingml/2006/main" noChangeAspect="1"/>
+            </wp:cNvGraphicFramePr>
+            <a:graphic xmlns:a="http://schemas.openxmlformats.org/drawingml/2006/main">
+              <a:graphicData uri="http://schemas.openxmlformats.org/drawingml/2006/picture">
+                <pic:pic xmlns:pic="http://schemas.openxmlformats.org/drawingml/2006/picture">
+                  <pic:nvPicPr>
+                    <pic:cNvPr id="1" name=""/>
+                    <pic:cNvPicPr/>
+                  </pic:nvPicPr>
+                  <pic:blipFill>
+                    <a:blip r:embed="rId12"/>
+                    <a:stretch>
+                      <a:fillRect/>
+                    </a:stretch>
+                  </pic:blipFill>
+                  <pic:spPr>
+                    <a:xfrm>
+                      <a:off x="0" y="0"/>
+                      <a:ext cx="5731510" cy="5731510"/>
+                    </a:xfrm>
+                    <a:prstGeom prst="rect">
+                      <a:avLst/>
+                    </a:prstGeom>
+                  </pic:spPr>
+                </pic:pic>
+              </a:graphicData>
+            </a:graphic>
+          </wp:inline>
+        </w:drawing>
+      </w:r>
+    </w:p>
+    <w:p>
+      <w:pPr>
+        <w:rPr>
+          <w14:shadow w14:blurRad="38100" w14:dist="25400" w14:dir="5400000" w14:sx="100000" w14:sy="100000" w14:kx="0" w14:ky="0" w14:algn="ctr">
+            <w14:srgbClr w14:val="6E747A">
+              <w14:alpha w14:val="57000"/>
+            </w14:srgbClr>
+          </w14:shadow>
+          <w14:textOutline w14:w="0" w14:cap="flat" w14:cmpd="sng" w14:algn="ctr">
+            <w14:noFill/>
+            <w14:prstDash w14:val="solid"/>
+            <w14:round/>
+          </w14:textOutline>
+        </w:rPr>
+      </w:pPr>
+    </w:p>
+    <w:p>
+      <w:pPr>
+        <w:rPr>
+          <w14:shadow w14:blurRad="38100" w14:dist="25400" w14:dir="5400000" w14:sx="100000" w14:sy="100000" w14:kx="0" w14:ky="0" w14:algn="ctr">
+            <w14:srgbClr w14:val="6E747A">
+              <w14:alpha w14:val="57000"/>
+            </w14:srgbClr>
+          </w14:shadow>
+          <w14:textOutline w14:w="0" w14:cap="flat" w14:cmpd="sng" w14:algn="ctr">
+            <w14:noFill/>
+            <w14:prstDash w14:val="solid"/>
+            <w14:round/>
+          </w14:textOutline>
+        </w:rPr>
+      </w:pPr>
+      <w:r>
+        <w:rPr>
+          <w14:shadow w14:blurRad="38100" w14:dist="25400" w14:dir="5400000" w14:sx="100000" w14:sy="100000" w14:kx="0" w14:ky="0" w14:algn="ctr">
+            <w14:srgbClr w14:val="6E747A">
+              <w14:alpha w14:val="57000"/>
+            </w14:srgbClr>
+          </w14:shadow>
+          <w14:textOutline w14:w="0" w14:cap="flat" w14:cmpd="sng" w14:algn="ctr">
+            <w14:noFill/>
+            <w14:prstDash w14:val="solid"/>
+            <w14:round/>
+          </w14:textOutline>
+        </w:rPr>
+        <w:t>Algorithms</w:t>
+      </w:r>
+    </w:p>
+    <w:p>
+      <w:pPr>
+        <w:rPr>
+          <w14:shadow w14:blurRad="38100" w14:dist="25400" w14:dir="5400000" w14:sx="100000" w14:sy="100000" w14:kx="0" w14:ky="0" w14:algn="ctr">
+            <w14:srgbClr w14:val="6E747A">
+              <w14:alpha w14:val="57000"/>
+            </w14:srgbClr>
+          </w14:shadow>
+          <w14:textOutline w14:w="0" w14:cap="flat" w14:cmpd="sng" w14:algn="ctr">
+            <w14:noFill/>
+            <w14:prstDash w14:val="solid"/>
+            <w14:round/>
+          </w14:textOutline>
+        </w:rPr>
+      </w:pPr>
+    </w:p>
+    <w:p>
+      <w:pPr>
+        <w:rPr>
+          <w14:shadow w14:blurRad="38100" w14:dist="25400" w14:dir="5400000" w14:sx="100000" w14:sy="100000" w14:kx="0" w14:ky="0" w14:algn="ctr">
+            <w14:srgbClr w14:val="6E747A">
+              <w14:alpha w14:val="57000"/>
+            </w14:srgbClr>
+          </w14:shadow>
+          <w14:textOutline w14:w="0" w14:cap="flat" w14:cmpd="sng" w14:algn="ctr">
+            <w14:noFill/>
+            <w14:prstDash w14:val="solid"/>
+            <w14:round/>
+          </w14:textOutline>
+        </w:rPr>
+      </w:pPr>
+    </w:p>
+    <w:p>
+      <w:pPr>
+        <w:rPr>
+          <w14:shadow w14:blurRad="38100" w14:dist="25400" w14:dir="5400000" w14:sx="100000" w14:sy="100000" w14:kx="0" w14:ky="0" w14:algn="ctr">
+            <w14:srgbClr w14:val="6E747A">
+              <w14:alpha w14:val="57000"/>
+            </w14:srgbClr>
+          </w14:shadow>
+          <w14:textOutline w14:w="0" w14:cap="flat" w14:cmpd="sng" w14:algn="ctr">
+            <w14:noFill/>
+            <w14:prstDash w14:val="solid"/>
+            <w14:round/>
+          </w14:textOutline>
+        </w:rPr>
+      </w:pPr>
+    </w:p>
+    <w:p>
+      <w:pPr>
+        <w:rPr>
+          <w14:shadow w14:blurRad="38100" w14:dist="25400" w14:dir="5400000" w14:sx="100000" w14:sy="100000" w14:kx="0" w14:ky="0" w14:algn="ctr">
+            <w14:srgbClr w14:val="6E747A">
+              <w14:alpha w14:val="57000"/>
+            </w14:srgbClr>
+          </w14:shadow>
+          <w14:textOutline w14:w="0" w14:cap="flat" w14:cmpd="sng" w14:algn="ctr">
+            <w14:noFill/>
+            <w14:prstDash w14:val="solid"/>
+            <w14:round/>
+          </w14:textOutline>
+        </w:rPr>
+      </w:pPr>
+    </w:p>
+    <w:p>
+      <w:pPr>
+        <w:rPr>
+          <w14:shadow w14:blurRad="38100" w14:dist="25400" w14:dir="5400000" w14:sx="100000" w14:sy="100000" w14:kx="0" w14:ky="0" w14:algn="ctr">
+            <w14:srgbClr w14:val="6E747A">
+              <w14:alpha w14:val="57000"/>
+            </w14:srgbClr>
+          </w14:shadow>
+          <w14:textOutline w14:w="0" w14:cap="flat" w14:cmpd="sng" w14:algn="ctr">
+            <w14:noFill/>
+            <w14:prstDash w14:val="solid"/>
+            <w14:round/>
+          </w14:textOutline>
+        </w:rPr>
+      </w:pPr>
+    </w:p>
+    <w:p>
+      <w:pPr>
+        <w:rPr>
+          <w14:shadow w14:blurRad="38100" w14:dist="25400" w14:dir="5400000" w14:sx="100000" w14:sy="100000" w14:kx="0" w14:ky="0" w14:algn="ctr">
+            <w14:srgbClr w14:val="6E747A">
+              <w14:alpha w14:val="57000"/>
+            </w14:srgbClr>
+          </w14:shadow>
+          <w14:textOutline w14:w="0" w14:cap="flat" w14:cmpd="sng" w14:algn="ctr">
+            <w14:noFill/>
+            <w14:prstDash w14:val="solid"/>
+            <w14:round/>
+          </w14:textOutline>
+        </w:rPr>
+      </w:pPr>
+    </w:p>
+    <w:p>
+      <w:pPr>
+        <w:rPr>
+          <w14:shadow w14:blurRad="38100" w14:dist="25400" w14:dir="5400000" w14:sx="100000" w14:sy="100000" w14:kx="0" w14:ky="0" w14:algn="ctr">
+            <w14:srgbClr w14:val="6E747A">
+              <w14:alpha w14:val="57000"/>
+            </w14:srgbClr>
+          </w14:shadow>
+          <w14:textOutline w14:w="0" w14:cap="flat" w14:cmpd="sng" w14:algn="ctr">
+            <w14:noFill/>
+            <w14:prstDash w14:val="solid"/>
+            <w14:round/>
+          </w14:textOutline>
+        </w:rPr>
+      </w:pPr>
+    </w:p>
+    <w:p>
+      <w:pPr>
+        <w:rPr>
+          <w14:shadow w14:blurRad="38100" w14:dist="25400" w14:dir="5400000" w14:sx="100000" w14:sy="100000" w14:kx="0" w14:ky="0" w14:algn="ctr">
+            <w14:srgbClr w14:val="6E747A">
+              <w14:alpha w14:val="57000"/>
+            </w14:srgbClr>
+          </w14:shadow>
+          <w14:textOutline w14:w="0" w14:cap="flat" w14:cmpd="sng" w14:algn="ctr">
+            <w14:noFill/>
+            <w14:prstDash w14:val="solid"/>
+            <w14:round/>
+          </w14:textOutline>
+        </w:rPr>
+      </w:pPr>
+    </w:p>
+    <w:p>
+      <w:pPr>
+        <w:rPr>
+          <w14:shadow w14:blurRad="38100" w14:dist="25400" w14:dir="5400000" w14:sx="100000" w14:sy="100000" w14:kx="0" w14:ky="0" w14:algn="ctr">
+            <w14:srgbClr w14:val="6E747A">
+              <w14:alpha w14:val="57000"/>
+            </w14:srgbClr>
+          </w14:shadow>
+          <w14:textOutline w14:w="0" w14:cap="flat" w14:cmpd="sng" w14:algn="ctr">
+            <w14:noFill/>
+            <w14:prstDash w14:val="solid"/>
+            <w14:round/>
+          </w14:textOutline>
+        </w:rPr>
+      </w:pPr>
+      <w:r>
+        <w:rPr>
+          <w14:shadow w14:blurRad="38100" w14:dist="25400" w14:dir="5400000" w14:sx="100000" w14:sy="100000" w14:kx="0" w14:ky="0" w14:algn="ctr">
+            <w14:srgbClr w14:val="6E747A">
+              <w14:alpha w14:val="57000"/>
+            </w14:srgbClr>
+          </w14:shadow>
+          <w14:textOutline w14:w="0" w14:cap="flat" w14:cmpd="sng" w14:algn="ctr">
+            <w14:noFill/>
+            <w14:prstDash w14:val="solid"/>
+            <w14:round/>
+          </w14:textOutline>
+        </w:rPr>
+        <w:lastRenderedPageBreak/>
+        <w:t>User account system log in/registe</w:t>
+      </w:r>
+      <w:r>
+        <w:rPr>
+          <w14:shadow w14:blurRad="38100" w14:dist="25400" w14:dir="5400000" w14:sx="100000" w14:sy="100000" w14:kx="0" w14:ky="0" w14:algn="ctr">
+            <w14:srgbClr w14:val="6E747A">
+              <w14:alpha w14:val="57000"/>
+            </w14:srgbClr>
+          </w14:shadow>
+          <w14:textOutline w14:w="0" w14:cap="flat" w14:cmpd="sng" w14:algn="ctr">
+            <w14:noFill/>
+            <w14:prstDash w14:val="solid"/>
+            <w14:round/>
+          </w14:textOutline>
+        </w:rPr>
+        <w:t>r</w:t>
+      </w:r>
+    </w:p>
+    <w:p>
+      <w:pPr>
+        <w:rPr>
+          <w14:shadow w14:blurRad="38100" w14:dist="25400" w14:dir="5400000" w14:sx="100000" w14:sy="100000" w14:kx="0" w14:ky="0" w14:algn="ctr">
+            <w14:srgbClr w14:val="6E747A">
+              <w14:alpha w14:val="57000"/>
+            </w14:srgbClr>
+          </w14:shadow>
+          <w14:textOutline w14:w="0" w14:cap="flat" w14:cmpd="sng" w14:algn="ctr">
+            <w14:noFill/>
+            <w14:prstDash w14:val="solid"/>
+            <w14:round/>
+          </w14:textOutline>
+        </w:rPr>
+      </w:pPr>
+      <w:r>
+        <w:rPr>
+          <w14:shadow w14:blurRad="38100" w14:dist="25400" w14:dir="5400000" w14:sx="100000" w14:sy="100000" w14:kx="0" w14:ky="0" w14:algn="ctr">
+            <w14:srgbClr w14:val="6E747A">
+              <w14:alpha w14:val="57000"/>
+            </w14:srgbClr>
+          </w14:shadow>
+          <w14:textOutline w14:w="0" w14:cap="flat" w14:cmpd="sng" w14:algn="ctr">
+            <w14:noFill/>
+            <w14:prstDash w14:val="solid"/>
+            <w14:round/>
+          </w14:textOutline>
+        </w:rPr>
+        <w:br/>
+      </w:r>
+      <w:r>
+        <w:rPr>
+          <w14:shadow w14:blurRad="38100" w14:dist="25400" w14:dir="5400000" w14:sx="100000" w14:sy="100000" w14:kx="0" w14:ky="0" w14:algn="ctr">
+            <w14:srgbClr w14:val="6E747A">
+              <w14:alpha w14:val="57000"/>
+            </w14:srgbClr>
+          </w14:shadow>
+          <w14:textOutline w14:w="0" w14:cap="flat" w14:cmpd="sng" w14:algn="ctr">
+            <w14:noFill/>
+            <w14:prstDash w14:val="solid"/>
+            <w14:round/>
+          </w14:textOutline>
+        </w:rPr>
+        <w:br/>
+      </w:r>
+      <w:r>
+        <w:rPr>
+          <w14:shadow w14:blurRad="38100" w14:dist="25400" w14:dir="5400000" w14:sx="100000" w14:sy="100000" w14:kx="0" w14:ky="0" w14:algn="ctr">
+            <w14:srgbClr w14:val="6E747A">
+              <w14:alpha w14:val="57000"/>
+            </w14:srgbClr>
+          </w14:shadow>
+          <w14:textOutline w14:w="0" w14:cap="flat" w14:cmpd="sng" w14:algn="ctr">
+            <w14:noFill/>
+            <w14:prstDash w14:val="solid"/>
+            <w14:round/>
+          </w14:textOutline>
+        </w:rPr>
+        <w:drawing>
+          <wp:inline distT="0" distB="0" distL="0" distR="0" wp14:anchorId="49E5414C" wp14:editId="3791D277">
+            <wp:extent cx="5731510" cy="7618730"/>
+            <wp:effectExtent l="0" t="0" r="2540" b="1270"/>
+            <wp:docPr id="9" name="Picture 9"/>
+            <wp:cNvGraphicFramePr>
+              <a:graphicFrameLocks xmlns:a="http://schemas.openxmlformats.org/drawingml/2006/main" noChangeAspect="1"/>
+            </wp:cNvGraphicFramePr>
+            <a:graphic xmlns:a="http://schemas.openxmlformats.org/drawingml/2006/main">
+              <a:graphicData uri="http://schemas.openxmlformats.org/drawingml/2006/picture">
+                <pic:pic xmlns:pic="http://schemas.openxmlformats.org/drawingml/2006/picture">
+                  <pic:nvPicPr>
+                    <pic:cNvPr id="1" name=""/>
+                    <pic:cNvPicPr/>
+                  </pic:nvPicPr>
+                  <pic:blipFill>
+                    <a:blip r:embed="rId13"/>
+                    <a:stretch>
+                      <a:fillRect/>
+                    </a:stretch>
+                  </pic:blipFill>
+                  <pic:spPr>
+                    <a:xfrm>
+                      <a:off x="0" y="0"/>
+                      <a:ext cx="5731510" cy="7618730"/>
+                    </a:xfrm>
+                    <a:prstGeom prst="rect">
+                      <a:avLst/>
+                    </a:prstGeom>
+                  </pic:spPr>
+                </pic:pic>
+              </a:graphicData>
+            </a:graphic>
+          </wp:inline>
+        </w:drawing>
+      </w:r>
+    </w:p>
+    <w:p>
+      <w:pPr>
+        <w:rPr>
+          <w14:shadow w14:blurRad="38100" w14:dist="25400" w14:dir="5400000" w14:sx="100000" w14:sy="100000" w14:kx="0" w14:ky="0" w14:algn="ctr">
+            <w14:srgbClr w14:val="6E747A">
+              <w14:alpha w14:val="57000"/>
+            </w14:srgbClr>
+          </w14:shadow>
+          <w14:textOutline w14:w="0" w14:cap="flat" w14:cmpd="sng" w14:algn="ctr">
+            <w14:noFill/>
+            <w14:prstDash w14:val="solid"/>
+            <w14:round/>
+          </w14:textOutline>
+        </w:rPr>
+      </w:pPr>
+    </w:p>
+    <w:p>
+      <w:pPr>
+        <w:rPr>
+          <w14:shadow w14:blurRad="38100" w14:dist="25400" w14:dir="5400000" w14:sx="100000" w14:sy="100000" w14:kx="0" w14:ky="0" w14:algn="ctr">
+            <w14:srgbClr w14:val="6E747A">
+              <w14:alpha w14:val="57000"/>
+            </w14:srgbClr>
+          </w14:shadow>
+          <w14:textOutline w14:w="0" w14:cap="flat" w14:cmpd="sng" w14:algn="ctr">
+            <w14:noFill/>
+            <w14:prstDash w14:val="solid"/>
+            <w14:round/>
+          </w14:textOutline>
+        </w:rPr>
+      </w:pPr>
     </w:p>
     <w:sectPr>
-      <w:headerReference w:type="even" r:id="rId12"/>
-      <w:headerReference w:type="default" r:id="rId13"/>
-      <w:footerReference w:type="even" r:id="rId14"/>
-      <w:footerReference w:type="default" r:id="rId15"/>
-      <w:headerReference w:type="first" r:id="rId16"/>
-      <w:footerReference w:type="first" r:id="rId17"/>
+      <w:headerReference w:type="even" r:id="rId14"/>
+      <w:headerReference w:type="default" r:id="rId15"/>
+      <w:footerReference w:type="even" r:id="rId16"/>
+      <w:footerReference w:type="default" r:id="rId17"/>
+      <w:headerReference w:type="first" r:id="rId18"/>
+      <w:footerReference w:type="first" r:id="rId19"/>
       <w:pgSz w:w="11906" w:h="16838"/>
       <w:pgMar w:top="1440" w:right="1440" w:bottom="1440" w:left="1440" w:header="708" w:footer="708" w:gutter="0"/>
       <w:cols w:space="708"/>

</xml_diff>

<commit_message>
algos finished testing plan started
</commit_message>
<xml_diff>
--- a/Task_1/Task1_DesignDocs.docx
+++ b/Task_1/Task1_DesignDocs.docx
@@ -2,6 +2,43 @@
 <file path=word/document.xml><?xml version="1.0" encoding="utf-8"?>
 <w:document xmlns:wpc="http://schemas.microsoft.com/office/word/2010/wordprocessingCanvas" xmlns:cx="http://schemas.microsoft.com/office/drawing/2014/chartex" xmlns:cx1="http://schemas.microsoft.com/office/drawing/2015/9/8/chartex" xmlns:cx2="http://schemas.microsoft.com/office/drawing/2015/10/21/chartex" xmlns:cx3="http://schemas.microsoft.com/office/drawing/2016/5/9/chartex" xmlns:cx4="http://schemas.microsoft.com/office/drawing/2016/5/10/chartex" xmlns:cx5="http://schemas.microsoft.com/office/drawing/2016/5/11/chartex" xmlns:cx6="http://schemas.microsoft.com/office/drawing/2016/5/12/chartex" xmlns:cx7="http://schemas.microsoft.com/office/drawing/2016/5/13/chartex" xmlns:cx8="http://schemas.microsoft.com/office/drawing/2016/5/14/chartex" xmlns:mc="http://schemas.openxmlformats.org/markup-compatibility/2006" xmlns:aink="http://schemas.microsoft.com/office/drawing/2016/ink" xmlns:am3d="http://schemas.microsoft.com/office/drawing/2017/model3d" xmlns:o="urn:schemas-microsoft-com:office:office" xmlns:r="http://schemas.openxmlformats.org/officeDocument/2006/relationships" xmlns:m="http://schemas.openxmlformats.org/officeDocument/2006/math" xmlns:v="urn:schemas-microsoft-com:vml" xmlns:wp14="http://schemas.microsoft.com/office/word/2010/wordprocessingDrawing" xmlns:wp="http://schemas.openxmlformats.org/drawingml/2006/wordprocessingDrawing" xmlns:w10="urn:schemas-microsoft-com:office:word" xmlns:w="http://schemas.openxmlformats.org/wordprocessingml/2006/main" xmlns:w14="http://schemas.microsoft.com/office/word/2010/wordml" xmlns:w15="http://schemas.microsoft.com/office/word/2012/wordml" xmlns:w16cex="http://schemas.microsoft.com/office/word/2018/wordml/cex" xmlns:w16cid="http://schemas.microsoft.com/office/word/2016/wordml/cid" xmlns:w16="http://schemas.microsoft.com/office/word/2018/wordml" xmlns:w16sdtdh="http://schemas.microsoft.com/office/word/2020/wordml/sdtdatahash" xmlns:w16se="http://schemas.microsoft.com/office/word/2015/wordml/symex" xmlns:wpg="http://schemas.microsoft.com/office/word/2010/wordprocessingGroup" xmlns:wpi="http://schemas.microsoft.com/office/word/2010/wordprocessingInk" xmlns:wne="http://schemas.microsoft.com/office/word/2006/wordml" xmlns:wps="http://schemas.microsoft.com/office/word/2010/wordprocessingShape" mc:Ignorable="w14 w15 w16se w16cid w16 w16cex w16sdtdh wp14">
   <w:body>
+    <w:p>
+      <w:pPr>
+        <w:rPr>
+          <w:color w:val="4472C4" w:themeColor="accent1"/>
+          <w:sz w:val="32"/>
+          <w:szCs w:val="32"/>
+          <w14:shadow w14:blurRad="38100" w14:dist="25400" w14:dir="5400000" w14:sx="100000" w14:sy="100000" w14:kx="0" w14:ky="0" w14:algn="ctr">
+            <w14:srgbClr w14:val="6E747A">
+              <w14:alpha w14:val="57000"/>
+            </w14:srgbClr>
+          </w14:shadow>
+          <w14:textOutline w14:w="0" w14:cap="flat" w14:cmpd="sng" w14:algn="ctr">
+            <w14:noFill/>
+            <w14:prstDash w14:val="solid"/>
+            <w14:round/>
+          </w14:textOutline>
+        </w:rPr>
+      </w:pPr>
+      <w:r>
+        <w:rPr>
+          <w:color w:val="4472C4" w:themeColor="accent1"/>
+          <w:sz w:val="32"/>
+          <w:szCs w:val="32"/>
+          <w14:shadow w14:blurRad="38100" w14:dist="25400" w14:dir="5400000" w14:sx="100000" w14:sy="100000" w14:kx="0" w14:ky="0" w14:algn="ctr">
+            <w14:srgbClr w14:val="6E747A">
+              <w14:alpha w14:val="57000"/>
+            </w14:srgbClr>
+          </w14:shadow>
+          <w14:textOutline w14:w="0" w14:cap="flat" w14:cmpd="sng" w14:algn="ctr">
+            <w14:noFill/>
+            <w14:prstDash w14:val="solid"/>
+            <w14:round/>
+          </w14:textOutline>
+        </w:rPr>
+        <w:t>App Designs</w:t>
+      </w:r>
+    </w:p>
     <w:p>
       <w:r>
         <w:rPr>
@@ -3647,6 +3684,9 @@
     <w:p>
       <w:pPr>
         <w:rPr>
+          <w:color w:val="4472C4" w:themeColor="accent1"/>
+          <w:sz w:val="32"/>
+          <w:szCs w:val="32"/>
           <w14:shadow w14:blurRad="38100" w14:dist="25400" w14:dir="5400000" w14:sx="100000" w14:sy="100000" w14:kx="0" w14:ky="0" w14:algn="ctr">
             <w14:srgbClr w14:val="6E747A">
               <w14:alpha w14:val="57000"/>
@@ -3661,6 +3701,9 @@
       </w:pPr>
       <w:r>
         <w:rPr>
+          <w:color w:val="4472C4" w:themeColor="accent1"/>
+          <w:sz w:val="32"/>
+          <w:szCs w:val="32"/>
           <w14:shadow w14:blurRad="38100" w14:dist="25400" w14:dir="5400000" w14:sx="100000" w14:sy="100000" w14:kx="0" w14:ky="0" w14:algn="ctr">
             <w14:srgbClr w14:val="6E747A">
               <w14:alpha w14:val="57000"/>
@@ -3672,12 +3715,13 @@
             <w14:round/>
           </w14:textOutline>
         </w:rPr>
-        <w:t>Data flow diagram</w:t>
-      </w:r>
-    </w:p>
-    <w:p>
-      <w:pPr>
-        <w:rPr>
+        <w:t xml:space="preserve">Data </w:t>
+      </w:r>
+      <w:r>
+        <w:rPr>
+          <w:color w:val="4472C4" w:themeColor="accent1"/>
+          <w:sz w:val="32"/>
+          <w:szCs w:val="32"/>
           <w14:shadow w14:blurRad="38100" w14:dist="25400" w14:dir="5400000" w14:sx="100000" w14:sy="100000" w14:kx="0" w14:ky="0" w14:algn="ctr">
             <w14:srgbClr w14:val="6E747A">
               <w14:alpha w14:val="57000"/>
@@ -3689,7 +3733,8 @@
             <w14:round/>
           </w14:textOutline>
         </w:rPr>
-      </w:pPr>
+        <w:t>Flow Diagram</w:t>
+      </w:r>
     </w:p>
     <w:p>
       <w:pPr>
@@ -3706,8 +3751,25 @@
           </w14:textOutline>
         </w:rPr>
       </w:pPr>
-      <w:r>
-        <w:rPr>
+    </w:p>
+    <w:p>
+      <w:pPr>
+        <w:rPr>
+          <w14:shadow w14:blurRad="38100" w14:dist="25400" w14:dir="5400000" w14:sx="100000" w14:sy="100000" w14:kx="0" w14:ky="0" w14:algn="ctr">
+            <w14:srgbClr w14:val="6E747A">
+              <w14:alpha w14:val="57000"/>
+            </w14:srgbClr>
+          </w14:shadow>
+          <w14:textOutline w14:w="0" w14:cap="flat" w14:cmpd="sng" w14:algn="ctr">
+            <w14:noFill/>
+            <w14:prstDash w14:val="solid"/>
+            <w14:round/>
+          </w14:textOutline>
+        </w:rPr>
+      </w:pPr>
+      <w:r>
+        <w:rPr>
+          <w:noProof/>
           <w14:shadow w14:blurRad="38100" w14:dist="25400" w14:dir="5400000" w14:sx="100000" w14:sy="100000" w14:kx="0" w14:ky="0" w14:algn="ctr">
             <w14:srgbClr w14:val="6E747A">
               <w14:alpha w14:val="57000"/>
@@ -3776,6 +3838,9 @@
     <w:p>
       <w:pPr>
         <w:rPr>
+          <w:color w:val="4472C4" w:themeColor="accent1"/>
+          <w:sz w:val="32"/>
+          <w:szCs w:val="32"/>
           <w14:shadow w14:blurRad="38100" w14:dist="25400" w14:dir="5400000" w14:sx="100000" w14:sy="100000" w14:kx="0" w14:ky="0" w14:algn="ctr">
             <w14:srgbClr w14:val="6E747A">
               <w14:alpha w14:val="57000"/>
@@ -3790,6 +3855,9 @@
       </w:pPr>
       <w:r>
         <w:rPr>
+          <w:color w:val="4472C4" w:themeColor="accent1"/>
+          <w:sz w:val="32"/>
+          <w:szCs w:val="32"/>
           <w14:shadow w14:blurRad="38100" w14:dist="25400" w14:dir="5400000" w14:sx="100000" w14:sy="100000" w14:kx="0" w14:ky="0" w14:algn="ctr">
             <w14:srgbClr w14:val="6E747A">
               <w14:alpha w14:val="57000"/>
@@ -3960,7 +4028,6 @@
             <w14:round/>
           </w14:textOutline>
         </w:rPr>
-        <w:lastRenderedPageBreak/>
         <w:t>User account system log in/registe</w:t>
       </w:r>
       <w:r>
@@ -4038,10 +4105,10 @@
           </w14:textOutline>
         </w:rPr>
         <w:drawing>
-          <wp:inline distT="0" distB="0" distL="0" distR="0" wp14:anchorId="49E5414C" wp14:editId="3791D277">
-            <wp:extent cx="5731510" cy="7618730"/>
-            <wp:effectExtent l="0" t="0" r="2540" b="1270"/>
-            <wp:docPr id="9" name="Picture 9"/>
+          <wp:inline distT="0" distB="0" distL="0" distR="0" wp14:anchorId="25B4AEE8" wp14:editId="5E7A95B7">
+            <wp:extent cx="5731510" cy="7134225"/>
+            <wp:effectExtent l="0" t="0" r="2540" b="9525"/>
+            <wp:docPr id="8" name="Picture 8"/>
             <wp:cNvGraphicFramePr>
               <a:graphicFrameLocks xmlns:a="http://schemas.openxmlformats.org/drawingml/2006/main" noChangeAspect="1"/>
             </wp:cNvGraphicFramePr>
@@ -4061,7 +4128,7 @@
                   <pic:spPr>
                     <a:xfrm>
                       <a:off x="0" y="0"/>
-                      <a:ext cx="5731510" cy="7618730"/>
+                      <a:ext cx="5731510" cy="7134225"/>
                     </a:xfrm>
                     <a:prstGeom prst="rect">
                       <a:avLst/>
@@ -4089,9 +4156,7 @@
           </w14:textOutline>
         </w:rPr>
       </w:pPr>
-    </w:p>
-    <w:p>
-      <w:pPr>
+      <w:r>
         <w:rPr>
           <w14:shadow w14:blurRad="38100" w14:dist="25400" w14:dir="5400000" w14:sx="100000" w14:sy="100000" w14:kx="0" w14:ky="0" w14:algn="ctr">
             <w14:srgbClr w14:val="6E747A">
@@ -4104,15 +4169,1286 @@
             <w14:round/>
           </w14:textOutline>
         </w:rPr>
+        <w:t>This diagram represents how the user will log in or register to an account using their info, in both cases the system uses the same database to access or create an account.</w:t>
+      </w:r>
+    </w:p>
+    <w:p>
+      <w:pPr>
+        <w:rPr>
+          <w14:shadow w14:blurRad="38100" w14:dist="25400" w14:dir="5400000" w14:sx="100000" w14:sy="100000" w14:kx="0" w14:ky="0" w14:algn="ctr">
+            <w14:srgbClr w14:val="6E747A">
+              <w14:alpha w14:val="57000"/>
+            </w14:srgbClr>
+          </w14:shadow>
+          <w14:textOutline w14:w="0" w14:cap="flat" w14:cmpd="sng" w14:algn="ctr">
+            <w14:noFill/>
+            <w14:prstDash w14:val="solid"/>
+            <w14:round/>
+          </w14:textOutline>
+        </w:rPr>
+      </w:pPr>
+    </w:p>
+    <w:p>
+      <w:pPr>
+        <w:rPr>
+          <w14:shadow w14:blurRad="38100" w14:dist="25400" w14:dir="5400000" w14:sx="100000" w14:sy="100000" w14:kx="0" w14:ky="0" w14:algn="ctr">
+            <w14:srgbClr w14:val="6E747A">
+              <w14:alpha w14:val="57000"/>
+            </w14:srgbClr>
+          </w14:shadow>
+          <w14:textOutline w14:w="0" w14:cap="flat" w14:cmpd="sng" w14:algn="ctr">
+            <w14:noFill/>
+            <w14:prstDash w14:val="solid"/>
+            <w14:round/>
+          </w14:textOutline>
+        </w:rPr>
+      </w:pPr>
+      <w:r>
+        <w:rPr>
+          <w14:shadow w14:blurRad="38100" w14:dist="25400" w14:dir="5400000" w14:sx="100000" w14:sy="100000" w14:kx="0" w14:ky="0" w14:algn="ctr">
+            <w14:srgbClr w14:val="6E747A">
+              <w14:alpha w14:val="57000"/>
+            </w14:srgbClr>
+          </w14:shadow>
+          <w14:textOutline w14:w="0" w14:cap="flat" w14:cmpd="sng" w14:algn="ctr">
+            <w14:noFill/>
+            <w14:prstDash w14:val="solid"/>
+            <w14:round/>
+          </w14:textOutline>
+        </w:rPr>
+        <w:lastRenderedPageBreak/>
+        <w:drawing>
+          <wp:inline distT="0" distB="0" distL="0" distR="0" wp14:anchorId="6B662B49" wp14:editId="4997787E">
+            <wp:extent cx="1807845" cy="8863330"/>
+            <wp:effectExtent l="0" t="0" r="1905" b="0"/>
+            <wp:docPr id="11" name="Picture 11"/>
+            <wp:cNvGraphicFramePr>
+              <a:graphicFrameLocks xmlns:a="http://schemas.openxmlformats.org/drawingml/2006/main" noChangeAspect="1"/>
+            </wp:cNvGraphicFramePr>
+            <a:graphic xmlns:a="http://schemas.openxmlformats.org/drawingml/2006/main">
+              <a:graphicData uri="http://schemas.openxmlformats.org/drawingml/2006/picture">
+                <pic:pic xmlns:pic="http://schemas.openxmlformats.org/drawingml/2006/picture">
+                  <pic:nvPicPr>
+                    <pic:cNvPr id="1" name=""/>
+                    <pic:cNvPicPr/>
+                  </pic:nvPicPr>
+                  <pic:blipFill>
+                    <a:blip r:embed="rId14"/>
+                    <a:stretch>
+                      <a:fillRect/>
+                    </a:stretch>
+                  </pic:blipFill>
+                  <pic:spPr>
+                    <a:xfrm>
+                      <a:off x="0" y="0"/>
+                      <a:ext cx="1807845" cy="8863330"/>
+                    </a:xfrm>
+                    <a:prstGeom prst="rect">
+                      <a:avLst/>
+                    </a:prstGeom>
+                  </pic:spPr>
+                </pic:pic>
+              </a:graphicData>
+            </a:graphic>
+          </wp:inline>
+        </w:drawing>
+      </w:r>
+    </w:p>
+    <w:p>
+      <w:pPr>
+        <w:rPr>
+          <w14:shadow w14:blurRad="38100" w14:dist="25400" w14:dir="5400000" w14:sx="100000" w14:sy="100000" w14:kx="0" w14:ky="0" w14:algn="ctr">
+            <w14:srgbClr w14:val="6E747A">
+              <w14:alpha w14:val="57000"/>
+            </w14:srgbClr>
+          </w14:shadow>
+          <w14:textOutline w14:w="0" w14:cap="flat" w14:cmpd="sng" w14:algn="ctr">
+            <w14:noFill/>
+            <w14:prstDash w14:val="solid"/>
+            <w14:round/>
+          </w14:textOutline>
+        </w:rPr>
+      </w:pPr>
+      <w:r>
+        <w:rPr>
+          <w14:shadow w14:blurRad="38100" w14:dist="25400" w14:dir="5400000" w14:sx="100000" w14:sy="100000" w14:kx="0" w14:ky="0" w14:algn="ctr">
+            <w14:srgbClr w14:val="6E747A">
+              <w14:alpha w14:val="57000"/>
+            </w14:srgbClr>
+          </w14:shadow>
+          <w14:textOutline w14:w="0" w14:cap="flat" w14:cmpd="sng" w14:algn="ctr">
+            <w14:noFill/>
+            <w14:prstDash w14:val="solid"/>
+            <w14:round/>
+          </w14:textOutline>
+        </w:rPr>
+        <w:lastRenderedPageBreak/>
+        <w:t>This flow chart shows how the app will collect the booking info from the user and store it in the database</w:t>
+      </w:r>
+    </w:p>
+    <w:p>
+      <w:pPr>
+        <w:rPr>
+          <w14:shadow w14:blurRad="38100" w14:dist="25400" w14:dir="5400000" w14:sx="100000" w14:sy="100000" w14:kx="0" w14:ky="0" w14:algn="ctr">
+            <w14:srgbClr w14:val="6E747A">
+              <w14:alpha w14:val="57000"/>
+            </w14:srgbClr>
+          </w14:shadow>
+          <w14:textOutline w14:w="0" w14:cap="flat" w14:cmpd="sng" w14:algn="ctr">
+            <w14:noFill/>
+            <w14:prstDash w14:val="solid"/>
+            <w14:round/>
+          </w14:textOutline>
+        </w:rPr>
+      </w:pPr>
+    </w:p>
+    <w:p>
+      <w:pPr>
+        <w:rPr>
+          <w14:shadow w14:blurRad="38100" w14:dist="25400" w14:dir="5400000" w14:sx="100000" w14:sy="100000" w14:kx="0" w14:ky="0" w14:algn="ctr">
+            <w14:srgbClr w14:val="6E747A">
+              <w14:alpha w14:val="57000"/>
+            </w14:srgbClr>
+          </w14:shadow>
+          <w14:textOutline w14:w="0" w14:cap="flat" w14:cmpd="sng" w14:algn="ctr">
+            <w14:noFill/>
+            <w14:prstDash w14:val="solid"/>
+            <w14:round/>
+          </w14:textOutline>
+        </w:rPr>
+      </w:pPr>
+    </w:p>
+    <w:p>
+      <w:pPr>
+        <w:rPr>
+          <w14:shadow w14:blurRad="38100" w14:dist="25400" w14:dir="5400000" w14:sx="100000" w14:sy="100000" w14:kx="0" w14:ky="0" w14:algn="ctr">
+            <w14:srgbClr w14:val="6E747A">
+              <w14:alpha w14:val="57000"/>
+            </w14:srgbClr>
+          </w14:shadow>
+          <w14:textOutline w14:w="0" w14:cap="flat" w14:cmpd="sng" w14:algn="ctr">
+            <w14:noFill/>
+            <w14:prstDash w14:val="solid"/>
+            <w14:round/>
+          </w14:textOutline>
+        </w:rPr>
+      </w:pPr>
+      <w:r>
+        <w:rPr>
+          <w14:shadow w14:blurRad="38100" w14:dist="25400" w14:dir="5400000" w14:sx="100000" w14:sy="100000" w14:kx="0" w14:ky="0" w14:algn="ctr">
+            <w14:srgbClr w14:val="6E747A">
+              <w14:alpha w14:val="57000"/>
+            </w14:srgbClr>
+          </w14:shadow>
+          <w14:textOutline w14:w="0" w14:cap="flat" w14:cmpd="sng" w14:algn="ctr">
+            <w14:noFill/>
+            <w14:prstDash w14:val="solid"/>
+            <w14:round/>
+          </w14:textOutline>
+        </w:rPr>
+        <w:lastRenderedPageBreak/>
+        <w:drawing>
+          <wp:inline distT="0" distB="0" distL="0" distR="0" wp14:anchorId="63F3383C" wp14:editId="04C14764">
+            <wp:extent cx="2705100" cy="8863330"/>
+            <wp:effectExtent l="0" t="0" r="0" b="0"/>
+            <wp:docPr id="12" name="Picture 12"/>
+            <wp:cNvGraphicFramePr>
+              <a:graphicFrameLocks xmlns:a="http://schemas.openxmlformats.org/drawingml/2006/main" noChangeAspect="1"/>
+            </wp:cNvGraphicFramePr>
+            <a:graphic xmlns:a="http://schemas.openxmlformats.org/drawingml/2006/main">
+              <a:graphicData uri="http://schemas.openxmlformats.org/drawingml/2006/picture">
+                <pic:pic xmlns:pic="http://schemas.openxmlformats.org/drawingml/2006/picture">
+                  <pic:nvPicPr>
+                    <pic:cNvPr id="1" name=""/>
+                    <pic:cNvPicPr/>
+                  </pic:nvPicPr>
+                  <pic:blipFill>
+                    <a:blip r:embed="rId15"/>
+                    <a:stretch>
+                      <a:fillRect/>
+                    </a:stretch>
+                  </pic:blipFill>
+                  <pic:spPr>
+                    <a:xfrm>
+                      <a:off x="0" y="0"/>
+                      <a:ext cx="2705100" cy="8863330"/>
+                    </a:xfrm>
+                    <a:prstGeom prst="rect">
+                      <a:avLst/>
+                    </a:prstGeom>
+                  </pic:spPr>
+                </pic:pic>
+              </a:graphicData>
+            </a:graphic>
+          </wp:inline>
+        </w:drawing>
+      </w:r>
+    </w:p>
+    <w:p>
+      <w:pPr>
+        <w:rPr>
+          <w14:shadow w14:blurRad="38100" w14:dist="25400" w14:dir="5400000" w14:sx="100000" w14:sy="100000" w14:kx="0" w14:ky="0" w14:algn="ctr">
+            <w14:srgbClr w14:val="6E747A">
+              <w14:alpha w14:val="57000"/>
+            </w14:srgbClr>
+          </w14:shadow>
+          <w14:textOutline w14:w="0" w14:cap="flat" w14:cmpd="sng" w14:algn="ctr">
+            <w14:noFill/>
+            <w14:prstDash w14:val="solid"/>
+            <w14:round/>
+          </w14:textOutline>
+        </w:rPr>
+      </w:pPr>
+      <w:r>
+        <w:rPr>
+          <w14:shadow w14:blurRad="38100" w14:dist="25400" w14:dir="5400000" w14:sx="100000" w14:sy="100000" w14:kx="0" w14:ky="0" w14:algn="ctr">
+            <w14:srgbClr w14:val="6E747A">
+              <w14:alpha w14:val="57000"/>
+            </w14:srgbClr>
+          </w14:shadow>
+          <w14:textOutline w14:w="0" w14:cap="flat" w14:cmpd="sng" w14:algn="ctr">
+            <w14:noFill/>
+            <w14:prstDash w14:val="solid"/>
+            <w14:round/>
+          </w14:textOutline>
+        </w:rPr>
+        <w:lastRenderedPageBreak/>
+        <w:t>This flow chart shows how the user can manage their booking from the profile page</w:t>
+      </w:r>
+    </w:p>
+    <w:p>
+      <w:pPr>
+        <w:rPr>
+          <w14:shadow w14:blurRad="38100" w14:dist="25400" w14:dir="5400000" w14:sx="100000" w14:sy="100000" w14:kx="0" w14:ky="0" w14:algn="ctr">
+            <w14:srgbClr w14:val="6E747A">
+              <w14:alpha w14:val="57000"/>
+            </w14:srgbClr>
+          </w14:shadow>
+          <w14:textOutline w14:w="0" w14:cap="flat" w14:cmpd="sng" w14:algn="ctr">
+            <w14:noFill/>
+            <w14:prstDash w14:val="solid"/>
+            <w14:round/>
+          </w14:textOutline>
+        </w:rPr>
+      </w:pPr>
+    </w:p>
+    <w:p>
+      <w:pPr>
+        <w:rPr>
+          <w:color w:val="4472C4" w:themeColor="accent1"/>
+          <w:sz w:val="32"/>
+          <w:szCs w:val="32"/>
+          <w14:shadow w14:blurRad="38100" w14:dist="25400" w14:dir="5400000" w14:sx="100000" w14:sy="100000" w14:kx="0" w14:ky="0" w14:algn="ctr">
+            <w14:srgbClr w14:val="6E747A">
+              <w14:alpha w14:val="57000"/>
+            </w14:srgbClr>
+          </w14:shadow>
+          <w14:textOutline w14:w="0" w14:cap="flat" w14:cmpd="sng" w14:algn="ctr">
+            <w14:noFill/>
+            <w14:prstDash w14:val="solid"/>
+            <w14:round/>
+          </w14:textOutline>
+        </w:rPr>
+      </w:pPr>
+      <w:r>
+        <w:rPr>
+          <w:color w:val="4472C4" w:themeColor="accent1"/>
+          <w:sz w:val="32"/>
+          <w:szCs w:val="32"/>
+          <w14:shadow w14:blurRad="38100" w14:dist="25400" w14:dir="5400000" w14:sx="100000" w14:sy="100000" w14:kx="0" w14:ky="0" w14:algn="ctr">
+            <w14:srgbClr w14:val="6E747A">
+              <w14:alpha w14:val="57000"/>
+            </w14:srgbClr>
+          </w14:shadow>
+          <w14:textOutline w14:w="0" w14:cap="flat" w14:cmpd="sng" w14:algn="ctr">
+            <w14:noFill/>
+            <w14:prstDash w14:val="solid"/>
+            <w14:round/>
+          </w14:textOutline>
+        </w:rPr>
+        <w:t>Test Plan</w:t>
+      </w:r>
+    </w:p>
+    <w:p>
+      <w:pPr>
+        <w:rPr>
+          <w14:shadow w14:blurRad="38100" w14:dist="25400" w14:dir="5400000" w14:sx="100000" w14:sy="100000" w14:kx="0" w14:ky="0" w14:algn="ctr">
+            <w14:srgbClr w14:val="6E747A">
+              <w14:alpha w14:val="57000"/>
+            </w14:srgbClr>
+          </w14:shadow>
+          <w14:textOutline w14:w="0" w14:cap="flat" w14:cmpd="sng" w14:algn="ctr">
+            <w14:noFill/>
+            <w14:prstDash w14:val="solid"/>
+            <w14:round/>
+          </w14:textOutline>
+        </w:rPr>
+      </w:pPr>
+    </w:p>
+    <w:tbl>
+      <w:tblPr>
+        <w:tblStyle w:val="TableGrid"/>
+        <w:tblW w:w="0" w:type="auto"/>
+        <w:tblLook w:val="04A0" w:firstRow="1" w:lastRow="0" w:firstColumn="1" w:lastColumn="0" w:noHBand="0" w:noVBand="1"/>
+      </w:tblPr>
+      <w:tblGrid>
+        <w:gridCol w:w="4508"/>
+        <w:gridCol w:w="4508"/>
+      </w:tblGrid>
+      <w:tr>
+        <w:tc>
+          <w:tcPr>
+            <w:tcW w:w="4508" w:type="dxa"/>
+          </w:tcPr>
+          <w:p>
+            <w:pPr>
+              <w:rPr>
+                <w14:shadow w14:blurRad="38100" w14:dist="25400" w14:dir="5400000" w14:sx="100000" w14:sy="100000" w14:kx="0" w14:ky="0" w14:algn="ctr">
+                  <w14:srgbClr w14:val="6E747A">
+                    <w14:alpha w14:val="57000"/>
+                  </w14:srgbClr>
+                </w14:shadow>
+                <w14:textOutline w14:w="0" w14:cap="flat" w14:cmpd="sng" w14:algn="ctr">
+                  <w14:noFill/>
+                  <w14:prstDash w14:val="solid"/>
+                  <w14:round/>
+                </w14:textOutline>
+              </w:rPr>
+            </w:pPr>
+            <w:r>
+              <w:rPr>
+                <w14:shadow w14:blurRad="38100" w14:dist="25400" w14:dir="5400000" w14:sx="100000" w14:sy="100000" w14:kx="0" w14:ky="0" w14:algn="ctr">
+                  <w14:srgbClr w14:val="6E747A">
+                    <w14:alpha w14:val="57000"/>
+                  </w14:srgbClr>
+                </w14:shadow>
+                <w14:textOutline w14:w="0" w14:cap="flat" w14:cmpd="sng" w14:algn="ctr">
+                  <w14:noFill/>
+                  <w14:prstDash w14:val="solid"/>
+                  <w14:round/>
+                </w14:textOutline>
+              </w:rPr>
+              <w:t>Test to be carried out</w:t>
+            </w:r>
+          </w:p>
+        </w:tc>
+        <w:tc>
+          <w:tcPr>
+            <w:tcW w:w="4508" w:type="dxa"/>
+          </w:tcPr>
+          <w:p>
+            <w:pPr>
+              <w:rPr>
+                <w14:shadow w14:blurRad="38100" w14:dist="25400" w14:dir="5400000" w14:sx="100000" w14:sy="100000" w14:kx="0" w14:ky="0" w14:algn="ctr">
+                  <w14:srgbClr w14:val="6E747A">
+                    <w14:alpha w14:val="57000"/>
+                  </w14:srgbClr>
+                </w14:shadow>
+                <w14:textOutline w14:w="0" w14:cap="flat" w14:cmpd="sng" w14:algn="ctr">
+                  <w14:noFill/>
+                  <w14:prstDash w14:val="solid"/>
+                  <w14:round/>
+                </w14:textOutline>
+              </w:rPr>
+            </w:pPr>
+            <w:r>
+              <w:rPr>
+                <w14:shadow w14:blurRad="38100" w14:dist="25400" w14:dir="5400000" w14:sx="100000" w14:sy="100000" w14:kx="0" w14:ky="0" w14:algn="ctr">
+                  <w14:srgbClr w14:val="6E747A">
+                    <w14:alpha w14:val="57000"/>
+                  </w14:srgbClr>
+                </w14:shadow>
+                <w14:textOutline w14:w="0" w14:cap="flat" w14:cmpd="sng" w14:algn="ctr">
+                  <w14:noFill/>
+                  <w14:prstDash w14:val="solid"/>
+                  <w14:round/>
+                </w14:textOutline>
+              </w:rPr>
+              <w:t>requirements</w:t>
+            </w:r>
+          </w:p>
+        </w:tc>
+      </w:tr>
+      <w:tr>
+        <w:tc>
+          <w:tcPr>
+            <w:tcW w:w="4508" w:type="dxa"/>
+          </w:tcPr>
+          <w:p>
+            <w:pPr>
+              <w:rPr>
+                <w14:shadow w14:blurRad="38100" w14:dist="25400" w14:dir="5400000" w14:sx="100000" w14:sy="100000" w14:kx="0" w14:ky="0" w14:algn="ctr">
+                  <w14:srgbClr w14:val="6E747A">
+                    <w14:alpha w14:val="57000"/>
+                  </w14:srgbClr>
+                </w14:shadow>
+                <w14:textOutline w14:w="0" w14:cap="flat" w14:cmpd="sng" w14:algn="ctr">
+                  <w14:noFill/>
+                  <w14:prstDash w14:val="solid"/>
+                  <w14:round/>
+                </w14:textOutline>
+              </w:rPr>
+            </w:pPr>
+            <w:r>
+              <w:rPr>
+                <w14:shadow w14:blurRad="38100" w14:dist="25400" w14:dir="5400000" w14:sx="100000" w14:sy="100000" w14:kx="0" w14:ky="0" w14:algn="ctr">
+                  <w14:srgbClr w14:val="6E747A">
+                    <w14:alpha w14:val="57000"/>
+                  </w14:srgbClr>
+                </w14:shadow>
+                <w14:textOutline w14:w="0" w14:cap="flat" w14:cmpd="sng" w14:algn="ctr">
+                  <w14:noFill/>
+                  <w14:prstDash w14:val="solid"/>
+                  <w14:round/>
+                </w14:textOutline>
+              </w:rPr>
+              <w:t>When signing up with incorrect username or password should result into an error</w:t>
+            </w:r>
+          </w:p>
+        </w:tc>
+        <w:tc>
+          <w:tcPr>
+            <w:tcW w:w="4508" w:type="dxa"/>
+          </w:tcPr>
+          <w:p>
+            <w:pPr>
+              <w:rPr>
+                <w14:shadow w14:blurRad="38100" w14:dist="25400" w14:dir="5400000" w14:sx="100000" w14:sy="100000" w14:kx="0" w14:ky="0" w14:algn="ctr">
+                  <w14:srgbClr w14:val="6E747A">
+                    <w14:alpha w14:val="57000"/>
+                  </w14:srgbClr>
+                </w14:shadow>
+                <w14:textOutline w14:w="0" w14:cap="flat" w14:cmpd="sng" w14:algn="ctr">
+                  <w14:noFill/>
+                  <w14:prstDash w14:val="solid"/>
+                  <w14:round/>
+                </w14:textOutline>
+              </w:rPr>
+            </w:pPr>
+            <w:r>
+              <w:rPr>
+                <w14:shadow w14:blurRad="38100" w14:dist="25400" w14:dir="5400000" w14:sx="100000" w14:sy="100000" w14:kx="0" w14:ky="0" w14:algn="ctr">
+                  <w14:srgbClr w14:val="6E747A">
+                    <w14:alpha w14:val="57000"/>
+                  </w14:srgbClr>
+                </w14:shadow>
+                <w14:textOutline w14:w="0" w14:cap="flat" w14:cmpd="sng" w14:algn="ctr">
+                  <w14:noFill/>
+                  <w14:prstDash w14:val="solid"/>
+                  <w14:round/>
+                </w14:textOutline>
+              </w:rPr>
+              <w:t>Access to the app</w:t>
+            </w:r>
+          </w:p>
+          <w:p>
+            <w:pPr>
+              <w:rPr>
+                <w14:shadow w14:blurRad="38100" w14:dist="25400" w14:dir="5400000" w14:sx="100000" w14:sy="100000" w14:kx="0" w14:ky="0" w14:algn="ctr">
+                  <w14:srgbClr w14:val="6E747A">
+                    <w14:alpha w14:val="57000"/>
+                  </w14:srgbClr>
+                </w14:shadow>
+                <w14:textOutline w14:w="0" w14:cap="flat" w14:cmpd="sng" w14:algn="ctr">
+                  <w14:noFill/>
+                  <w14:prstDash w14:val="solid"/>
+                  <w14:round/>
+                </w14:textOutline>
+              </w:rPr>
+            </w:pPr>
+            <w:r>
+              <w:rPr>
+                <w14:shadow w14:blurRad="38100" w14:dist="25400" w14:dir="5400000" w14:sx="100000" w14:sy="100000" w14:kx="0" w14:ky="0" w14:algn="ctr">
+                  <w14:srgbClr w14:val="6E747A">
+                    <w14:alpha w14:val="57000"/>
+                  </w14:srgbClr>
+                </w14:shadow>
+                <w14:textOutline w14:w="0" w14:cap="flat" w14:cmpd="sng" w14:algn="ctr">
+                  <w14:noFill/>
+                  <w14:prstDash w14:val="solid"/>
+                  <w14:round/>
+                </w14:textOutline>
+              </w:rPr>
+              <w:t>Compute</w:t>
+            </w:r>
+          </w:p>
+          <w:p>
+            <w:pPr>
+              <w:rPr>
+                <w14:shadow w14:blurRad="38100" w14:dist="25400" w14:dir="5400000" w14:sx="100000" w14:sy="100000" w14:kx="0" w14:ky="0" w14:algn="ctr">
+                  <w14:srgbClr w14:val="6E747A">
+                    <w14:alpha w14:val="57000"/>
+                  </w14:srgbClr>
+                </w14:shadow>
+                <w14:textOutline w14:w="0" w14:cap="flat" w14:cmpd="sng" w14:algn="ctr">
+                  <w14:noFill/>
+                  <w14:prstDash w14:val="solid"/>
+                  <w14:round/>
+                </w14:textOutline>
+              </w:rPr>
+            </w:pPr>
+            <w:r>
+              <w:rPr>
+                <w14:shadow w14:blurRad="38100" w14:dist="25400" w14:dir="5400000" w14:sx="100000" w14:sy="100000" w14:kx="0" w14:ky="0" w14:algn="ctr">
+                  <w14:srgbClr w14:val="6E747A">
+                    <w14:alpha w14:val="57000"/>
+                  </w14:srgbClr>
+                </w14:shadow>
+                <w14:textOutline w14:w="0" w14:cap="flat" w14:cmpd="sng" w14:algn="ctr">
+                  <w14:noFill/>
+                  <w14:prstDash w14:val="solid"/>
+                  <w14:round/>
+                </w14:textOutline>
+              </w:rPr>
+              <w:t>Incorrect username or password</w:t>
+            </w:r>
+          </w:p>
+        </w:tc>
+      </w:tr>
+      <w:tr>
+        <w:tc>
+          <w:tcPr>
+            <w:tcW w:w="4508" w:type="dxa"/>
+          </w:tcPr>
+          <w:p>
+            <w:pPr>
+              <w:rPr>
+                <w14:shadow w14:blurRad="38100" w14:dist="25400" w14:dir="5400000" w14:sx="100000" w14:sy="100000" w14:kx="0" w14:ky="0" w14:algn="ctr">
+                  <w14:srgbClr w14:val="6E747A">
+                    <w14:alpha w14:val="57000"/>
+                  </w14:srgbClr>
+                </w14:shadow>
+                <w14:textOutline w14:w="0" w14:cap="flat" w14:cmpd="sng" w14:algn="ctr">
+                  <w14:noFill/>
+                  <w14:prstDash w14:val="solid"/>
+                  <w14:round/>
+                </w14:textOutline>
+              </w:rPr>
+            </w:pPr>
+            <w:r>
+              <w:rPr>
+                <w14:shadow w14:blurRad="38100" w14:dist="25400" w14:dir="5400000" w14:sx="100000" w14:sy="100000" w14:kx="0" w14:ky="0" w14:algn="ctr">
+                  <w14:srgbClr w14:val="6E747A">
+                    <w14:alpha w14:val="57000"/>
+                  </w14:srgbClr>
+                </w14:shadow>
+                <w14:textOutline w14:w="0" w14:cap="flat" w14:cmpd="sng" w14:algn="ctr">
+                  <w14:noFill/>
+                  <w14:prstDash w14:val="solid"/>
+                  <w14:round/>
+                </w14:textOutline>
+              </w:rPr>
+              <w:t>When signing up with a correct username or password the app should log in the user</w:t>
+            </w:r>
+          </w:p>
+        </w:tc>
+        <w:tc>
+          <w:tcPr>
+            <w:tcW w:w="4508" w:type="dxa"/>
+          </w:tcPr>
+          <w:p>
+            <w:pPr>
+              <w:rPr>
+                <w14:shadow w14:blurRad="38100" w14:dist="25400" w14:dir="5400000" w14:sx="100000" w14:sy="100000" w14:kx="0" w14:ky="0" w14:algn="ctr">
+                  <w14:srgbClr w14:val="6E747A">
+                    <w14:alpha w14:val="57000"/>
+                  </w14:srgbClr>
+                </w14:shadow>
+                <w14:textOutline w14:w="0" w14:cap="flat" w14:cmpd="sng" w14:algn="ctr">
+                  <w14:noFill/>
+                  <w14:prstDash w14:val="solid"/>
+                  <w14:round/>
+                </w14:textOutline>
+              </w:rPr>
+            </w:pPr>
+            <w:r>
+              <w:rPr>
+                <w14:shadow w14:blurRad="38100" w14:dist="25400" w14:dir="5400000" w14:sx="100000" w14:sy="100000" w14:kx="0" w14:ky="0" w14:algn="ctr">
+                  <w14:srgbClr w14:val="6E747A">
+                    <w14:alpha w14:val="57000"/>
+                  </w14:srgbClr>
+                </w14:shadow>
+                <w14:textOutline w14:w="0" w14:cap="flat" w14:cmpd="sng" w14:algn="ctr">
+                  <w14:noFill/>
+                  <w14:prstDash w14:val="solid"/>
+                  <w14:round/>
+                </w14:textOutline>
+              </w:rPr>
+              <w:t>Access to the app</w:t>
+            </w:r>
+          </w:p>
+          <w:p>
+            <w:pPr>
+              <w:rPr>
+                <w14:shadow w14:blurRad="38100" w14:dist="25400" w14:dir="5400000" w14:sx="100000" w14:sy="100000" w14:kx="0" w14:ky="0" w14:algn="ctr">
+                  <w14:srgbClr w14:val="6E747A">
+                    <w14:alpha w14:val="57000"/>
+                  </w14:srgbClr>
+                </w14:shadow>
+                <w14:textOutline w14:w="0" w14:cap="flat" w14:cmpd="sng" w14:algn="ctr">
+                  <w14:noFill/>
+                  <w14:prstDash w14:val="solid"/>
+                  <w14:round/>
+                </w14:textOutline>
+              </w:rPr>
+            </w:pPr>
+            <w:r>
+              <w:rPr>
+                <w14:shadow w14:blurRad="38100" w14:dist="25400" w14:dir="5400000" w14:sx="100000" w14:sy="100000" w14:kx="0" w14:ky="0" w14:algn="ctr">
+                  <w14:srgbClr w14:val="6E747A">
+                    <w14:alpha w14:val="57000"/>
+                  </w14:srgbClr>
+                </w14:shadow>
+                <w14:textOutline w14:w="0" w14:cap="flat" w14:cmpd="sng" w14:algn="ctr">
+                  <w14:noFill/>
+                  <w14:prstDash w14:val="solid"/>
+                  <w14:round/>
+                </w14:textOutline>
+              </w:rPr>
+              <w:t>Compute</w:t>
+            </w:r>
+          </w:p>
+          <w:p>
+            <w:pPr>
+              <w:rPr>
+                <w14:shadow w14:blurRad="38100" w14:dist="25400" w14:dir="5400000" w14:sx="100000" w14:sy="100000" w14:kx="0" w14:ky="0" w14:algn="ctr">
+                  <w14:srgbClr w14:val="6E747A">
+                    <w14:alpha w14:val="57000"/>
+                  </w14:srgbClr>
+                </w14:shadow>
+                <w14:textOutline w14:w="0" w14:cap="flat" w14:cmpd="sng" w14:algn="ctr">
+                  <w14:noFill/>
+                  <w14:prstDash w14:val="solid"/>
+                  <w14:round/>
+                </w14:textOutline>
+              </w:rPr>
+            </w:pPr>
+            <w:r>
+              <w:rPr>
+                <w14:shadow w14:blurRad="38100" w14:dist="25400" w14:dir="5400000" w14:sx="100000" w14:sy="100000" w14:kx="0" w14:ky="0" w14:algn="ctr">
+                  <w14:srgbClr w14:val="6E747A">
+                    <w14:alpha w14:val="57000"/>
+                  </w14:srgbClr>
+                </w14:shadow>
+                <w14:textOutline w14:w="0" w14:cap="flat" w14:cmpd="sng" w14:algn="ctr">
+                  <w14:noFill/>
+                  <w14:prstDash w14:val="solid"/>
+                  <w14:round/>
+                </w14:textOutline>
+              </w:rPr>
+              <w:t>C</w:t>
+            </w:r>
+            <w:r>
+              <w:rPr>
+                <w14:shadow w14:blurRad="38100" w14:dist="25400" w14:dir="5400000" w14:sx="100000" w14:sy="100000" w14:kx="0" w14:ky="0" w14:algn="ctr">
+                  <w14:srgbClr w14:val="6E747A">
+                    <w14:alpha w14:val="57000"/>
+                  </w14:srgbClr>
+                </w14:shadow>
+                <w14:textOutline w14:w="0" w14:cap="flat" w14:cmpd="sng" w14:algn="ctr">
+                  <w14:noFill/>
+                  <w14:prstDash w14:val="solid"/>
+                  <w14:round/>
+                </w14:textOutline>
+              </w:rPr>
+              <w:t>orrect username or password</w:t>
+            </w:r>
+          </w:p>
+        </w:tc>
+      </w:tr>
+      <w:tr>
+        <w:tc>
+          <w:tcPr>
+            <w:tcW w:w="4508" w:type="dxa"/>
+          </w:tcPr>
+          <w:p>
+            <w:pPr>
+              <w:rPr>
+                <w14:shadow w14:blurRad="38100" w14:dist="25400" w14:dir="5400000" w14:sx="100000" w14:sy="100000" w14:kx="0" w14:ky="0" w14:algn="ctr">
+                  <w14:srgbClr w14:val="6E747A">
+                    <w14:alpha w14:val="57000"/>
+                  </w14:srgbClr>
+                </w14:shadow>
+                <w14:textOutline w14:w="0" w14:cap="flat" w14:cmpd="sng" w14:algn="ctr">
+                  <w14:noFill/>
+                  <w14:prstDash w14:val="solid"/>
+                  <w14:round/>
+                </w14:textOutline>
+              </w:rPr>
+            </w:pPr>
+            <w:r>
+              <w:rPr>
+                <w14:shadow w14:blurRad="38100" w14:dist="25400" w14:dir="5400000" w14:sx="100000" w14:sy="100000" w14:kx="0" w14:ky="0" w14:algn="ctr">
+                  <w14:srgbClr w14:val="6E747A">
+                    <w14:alpha w14:val="57000"/>
+                  </w14:srgbClr>
+                </w14:shadow>
+                <w14:textOutline w14:w="0" w14:cap="flat" w14:cmpd="sng" w14:algn="ctr">
+                  <w14:noFill/>
+                  <w14:prstDash w14:val="solid"/>
+                  <w14:round/>
+                </w14:textOutline>
+              </w:rPr>
+              <w:t>When signing up</w:t>
+            </w:r>
+            <w:r>
+              <w:rPr>
+                <w14:shadow w14:blurRad="38100" w14:dist="25400" w14:dir="5400000" w14:sx="100000" w14:sy="100000" w14:kx="0" w14:ky="0" w14:algn="ctr">
+                  <w14:srgbClr w14:val="6E747A">
+                    <w14:alpha w14:val="57000"/>
+                  </w14:srgbClr>
+                </w14:shadow>
+                <w14:textOutline w14:w="0" w14:cap="flat" w14:cmpd="sng" w14:algn="ctr">
+                  <w14:noFill/>
+                  <w14:prstDash w14:val="solid"/>
+                  <w14:round/>
+                </w14:textOutline>
+              </w:rPr>
+              <w:t xml:space="preserve"> </w:t>
+            </w:r>
+            <w:r>
+              <w:rPr>
+                <w14:shadow w14:blurRad="38100" w14:dist="25400" w14:dir="5400000" w14:sx="100000" w14:sy="100000" w14:kx="0" w14:ky="0" w14:algn="ctr">
+                  <w14:srgbClr w14:val="6E747A">
+                    <w14:alpha w14:val="57000"/>
+                  </w14:srgbClr>
+                </w14:shadow>
+                <w14:textOutline w14:w="0" w14:cap="flat" w14:cmpd="sng" w14:algn="ctr">
+                  <w14:noFill/>
+                  <w14:prstDash w14:val="solid"/>
+                  <w14:round/>
+                </w14:textOutline>
+              </w:rPr>
+              <w:t>entering if the confirmed</w:t>
+            </w:r>
+            <w:r>
+              <w:rPr>
+                <w14:shadow w14:blurRad="38100" w14:dist="25400" w14:dir="5400000" w14:sx="100000" w14:sy="100000" w14:kx="0" w14:ky="0" w14:algn="ctr">
+                  <w14:srgbClr w14:val="6E747A">
+                    <w14:alpha w14:val="57000"/>
+                  </w14:srgbClr>
+                </w14:shadow>
+                <w14:textOutline w14:w="0" w14:cap="flat" w14:cmpd="sng" w14:algn="ctr">
+                  <w14:noFill/>
+                  <w14:prstDash w14:val="solid"/>
+                  <w14:round/>
+                </w14:textOutline>
+              </w:rPr>
+              <w:t xml:space="preserve"> p</w:t>
+            </w:r>
+            <w:r>
+              <w:rPr>
+                <w14:shadow w14:blurRad="38100" w14:dist="25400" w14:dir="5400000" w14:sx="100000" w14:sy="100000" w14:kx="0" w14:ky="0" w14:algn="ctr">
+                  <w14:srgbClr w14:val="6E747A">
+                    <w14:alpha w14:val="57000"/>
+                  </w14:srgbClr>
+                </w14:shadow>
+                <w14:textOutline w14:w="0" w14:cap="flat" w14:cmpd="sng" w14:algn="ctr">
+                  <w14:noFill/>
+                  <w14:prstDash w14:val="solid"/>
+                  <w14:round/>
+                </w14:textOutline>
+              </w:rPr>
+              <w:t>assword field does not</w:t>
+            </w:r>
+            <w:r>
+              <w:rPr>
+                <w14:shadow w14:blurRad="38100" w14:dist="25400" w14:dir="5400000" w14:sx="100000" w14:sy="100000" w14:kx="0" w14:ky="0" w14:algn="ctr">
+                  <w14:srgbClr w14:val="6E747A">
+                    <w14:alpha w14:val="57000"/>
+                  </w14:srgbClr>
+                </w14:shadow>
+                <w14:textOutline w14:w="0" w14:cap="flat" w14:cmpd="sng" w14:algn="ctr">
+                  <w14:noFill/>
+                  <w14:prstDash w14:val="solid"/>
+                  <w14:round/>
+                </w14:textOutline>
+              </w:rPr>
+              <w:t xml:space="preserve"> </w:t>
+            </w:r>
+            <w:r>
+              <w:rPr>
+                <w14:shadow w14:blurRad="38100" w14:dist="25400" w14:dir="5400000" w14:sx="100000" w14:sy="100000" w14:kx="0" w14:ky="0" w14:algn="ctr">
+                  <w14:srgbClr w14:val="6E747A">
+                    <w14:alpha w14:val="57000"/>
+                  </w14:srgbClr>
+                </w14:shadow>
+                <w14:textOutline w14:w="0" w14:cap="flat" w14:cmpd="sng" w14:algn="ctr">
+                  <w14:noFill/>
+                  <w14:prstDash w14:val="solid"/>
+                  <w14:round/>
+                </w14:textOutline>
+              </w:rPr>
+              <w:t>match the password it</w:t>
+            </w:r>
+          </w:p>
+          <w:p>
+            <w:pPr>
+              <w:rPr>
+                <w14:shadow w14:blurRad="38100" w14:dist="25400" w14:dir="5400000" w14:sx="100000" w14:sy="100000" w14:kx="0" w14:ky="0" w14:algn="ctr">
+                  <w14:srgbClr w14:val="6E747A">
+                    <w14:alpha w14:val="57000"/>
+                  </w14:srgbClr>
+                </w14:shadow>
+                <w14:textOutline w14:w="0" w14:cap="flat" w14:cmpd="sng" w14:algn="ctr">
+                  <w14:noFill/>
+                  <w14:prstDash w14:val="solid"/>
+                  <w14:round/>
+                </w14:textOutline>
+              </w:rPr>
+            </w:pPr>
+            <w:r>
+              <w:rPr>
+                <w14:shadow w14:blurRad="38100" w14:dist="25400" w14:dir="5400000" w14:sx="100000" w14:sy="100000" w14:kx="0" w14:ky="0" w14:algn="ctr">
+                  <w14:srgbClr w14:val="6E747A">
+                    <w14:alpha w14:val="57000"/>
+                  </w14:srgbClr>
+                </w14:shadow>
+                <w14:textOutline w14:w="0" w14:cap="flat" w14:cmpd="sng" w14:algn="ctr">
+                  <w14:noFill/>
+                  <w14:prstDash w14:val="solid"/>
+                  <w14:round/>
+                </w14:textOutline>
+              </w:rPr>
+              <w:t>will result in an error</w:t>
+            </w:r>
+          </w:p>
+        </w:tc>
+        <w:tc>
+          <w:tcPr>
+            <w:tcW w:w="4508" w:type="dxa"/>
+          </w:tcPr>
+          <w:p>
+            <w:pPr>
+              <w:rPr>
+                <w14:shadow w14:blurRad="38100" w14:dist="25400" w14:dir="5400000" w14:sx="100000" w14:sy="100000" w14:kx="0" w14:ky="0" w14:algn="ctr">
+                  <w14:srgbClr w14:val="6E747A">
+                    <w14:alpha w14:val="57000"/>
+                  </w14:srgbClr>
+                </w14:shadow>
+                <w14:textOutline w14:w="0" w14:cap="flat" w14:cmpd="sng" w14:algn="ctr">
+                  <w14:noFill/>
+                  <w14:prstDash w14:val="solid"/>
+                  <w14:round/>
+                </w14:textOutline>
+              </w:rPr>
+            </w:pPr>
+            <w:r>
+              <w:rPr>
+                <w14:shadow w14:blurRad="38100" w14:dist="25400" w14:dir="5400000" w14:sx="100000" w14:sy="100000" w14:kx="0" w14:ky="0" w14:algn="ctr">
+                  <w14:srgbClr w14:val="6E747A">
+                    <w14:alpha w14:val="57000"/>
+                  </w14:srgbClr>
+                </w14:shadow>
+                <w14:textOutline w14:w="0" w14:cap="flat" w14:cmpd="sng" w14:algn="ctr">
+                  <w14:noFill/>
+                  <w14:prstDash w14:val="solid"/>
+                  <w14:round/>
+                </w14:textOutline>
+              </w:rPr>
+              <w:t xml:space="preserve">Access to the </w:t>
+            </w:r>
+            <w:r>
+              <w:rPr>
+                <w14:shadow w14:blurRad="38100" w14:dist="25400" w14:dir="5400000" w14:sx="100000" w14:sy="100000" w14:kx="0" w14:ky="0" w14:algn="ctr">
+                  <w14:srgbClr w14:val="6E747A">
+                    <w14:alpha w14:val="57000"/>
+                  </w14:srgbClr>
+                </w14:shadow>
+                <w14:textOutline w14:w="0" w14:cap="flat" w14:cmpd="sng" w14:algn="ctr">
+                  <w14:noFill/>
+                  <w14:prstDash w14:val="solid"/>
+                  <w14:round/>
+                </w14:textOutline>
+              </w:rPr>
+              <w:t>app</w:t>
+            </w:r>
+          </w:p>
+          <w:p>
+            <w:pPr>
+              <w:rPr>
+                <w14:shadow w14:blurRad="38100" w14:dist="25400" w14:dir="5400000" w14:sx="100000" w14:sy="100000" w14:kx="0" w14:ky="0" w14:algn="ctr">
+                  <w14:srgbClr w14:val="6E747A">
+                    <w14:alpha w14:val="57000"/>
+                  </w14:srgbClr>
+                </w14:shadow>
+                <w14:textOutline w14:w="0" w14:cap="flat" w14:cmpd="sng" w14:algn="ctr">
+                  <w14:noFill/>
+                  <w14:prstDash w14:val="solid"/>
+                  <w14:round/>
+                </w14:textOutline>
+              </w:rPr>
+            </w:pPr>
+            <w:r>
+              <w:rPr>
+                <w14:shadow w14:blurRad="38100" w14:dist="25400" w14:dir="5400000" w14:sx="100000" w14:sy="100000" w14:kx="0" w14:ky="0" w14:algn="ctr">
+                  <w14:srgbClr w14:val="6E747A">
+                    <w14:alpha w14:val="57000"/>
+                  </w14:srgbClr>
+                </w14:shadow>
+                <w14:textOutline w14:w="0" w14:cap="flat" w14:cmpd="sng" w14:algn="ctr">
+                  <w14:noFill/>
+                  <w14:prstDash w14:val="solid"/>
+                  <w14:round/>
+                </w14:textOutline>
+              </w:rPr>
+              <w:t xml:space="preserve">Computer </w:t>
+            </w:r>
+          </w:p>
+          <w:p>
+            <w:pPr>
+              <w:rPr>
+                <w14:shadow w14:blurRad="38100" w14:dist="25400" w14:dir="5400000" w14:sx="100000" w14:sy="100000" w14:kx="0" w14:ky="0" w14:algn="ctr">
+                  <w14:srgbClr w14:val="6E747A">
+                    <w14:alpha w14:val="57000"/>
+                  </w14:srgbClr>
+                </w14:shadow>
+                <w14:textOutline w14:w="0" w14:cap="flat" w14:cmpd="sng" w14:algn="ctr">
+                  <w14:noFill/>
+                  <w14:prstDash w14:val="solid"/>
+                  <w14:round/>
+                </w14:textOutline>
+              </w:rPr>
+            </w:pPr>
+            <w:r>
+              <w:rPr>
+                <w14:shadow w14:blurRad="38100" w14:dist="25400" w14:dir="5400000" w14:sx="100000" w14:sy="100000" w14:kx="0" w14:ky="0" w14:algn="ctr">
+                  <w14:srgbClr w14:val="6E747A">
+                    <w14:alpha w14:val="57000"/>
+                  </w14:srgbClr>
+                </w14:shadow>
+                <w14:textOutline w14:w="0" w14:cap="flat" w14:cmpd="sng" w14:algn="ctr">
+                  <w14:noFill/>
+                  <w14:prstDash w14:val="solid"/>
+                  <w14:round/>
+                </w14:textOutline>
+              </w:rPr>
+              <w:t>Incorrect confirm password input</w:t>
+            </w:r>
+          </w:p>
+        </w:tc>
+      </w:tr>
+      <w:tr>
+        <w:tc>
+          <w:tcPr>
+            <w:tcW w:w="4508" w:type="dxa"/>
+          </w:tcPr>
+          <w:p>
+            <w:pPr>
+              <w:rPr>
+                <w14:shadow w14:blurRad="38100" w14:dist="25400" w14:dir="5400000" w14:sx="100000" w14:sy="100000" w14:kx="0" w14:ky="0" w14:algn="ctr">
+                  <w14:srgbClr w14:val="6E747A">
+                    <w14:alpha w14:val="57000"/>
+                  </w14:srgbClr>
+                </w14:shadow>
+                <w14:textOutline w14:w="0" w14:cap="flat" w14:cmpd="sng" w14:algn="ctr">
+                  <w14:noFill/>
+                  <w14:prstDash w14:val="solid"/>
+                  <w14:round/>
+                </w14:textOutline>
+              </w:rPr>
+            </w:pPr>
+            <w:r>
+              <w:rPr>
+                <w14:shadow w14:blurRad="38100" w14:dist="25400" w14:dir="5400000" w14:sx="100000" w14:sy="100000" w14:kx="0" w14:ky="0" w14:algn="ctr">
+                  <w14:srgbClr w14:val="6E747A">
+                    <w14:alpha w14:val="57000"/>
+                  </w14:srgbClr>
+                </w14:shadow>
+                <w14:textOutline w14:w="0" w14:cap="flat" w14:cmpd="sng" w14:algn="ctr">
+                  <w14:noFill/>
+                  <w14:prstDash w14:val="solid"/>
+                  <w14:round/>
+                </w14:textOutline>
+              </w:rPr>
+              <w:t>When logging in if the username and password are correct the user will be redirected to t</w:t>
+            </w:r>
+            <w:r>
+              <w:rPr>
+                <w14:shadow w14:blurRad="38100" w14:dist="25400" w14:dir="5400000" w14:sx="100000" w14:sy="100000" w14:kx="0" w14:ky="0" w14:algn="ctr">
+                  <w14:srgbClr w14:val="6E747A">
+                    <w14:alpha w14:val="57000"/>
+                  </w14:srgbClr>
+                </w14:shadow>
+                <w14:textOutline w14:w="0" w14:cap="flat" w14:cmpd="sng" w14:algn="ctr">
+                  <w14:noFill/>
+                  <w14:prstDash w14:val="solid"/>
+                  <w14:round/>
+                </w14:textOutline>
+              </w:rPr>
+              <w:t>he previous page before log in/sign up</w:t>
+            </w:r>
+          </w:p>
+        </w:tc>
+        <w:tc>
+          <w:tcPr>
+            <w:tcW w:w="4508" w:type="dxa"/>
+          </w:tcPr>
+          <w:p>
+            <w:pPr>
+              <w:rPr>
+                <w14:shadow w14:blurRad="38100" w14:dist="25400" w14:dir="5400000" w14:sx="100000" w14:sy="100000" w14:kx="0" w14:ky="0" w14:algn="ctr">
+                  <w14:srgbClr w14:val="6E747A">
+                    <w14:alpha w14:val="57000"/>
+                  </w14:srgbClr>
+                </w14:shadow>
+                <w14:textOutline w14:w="0" w14:cap="flat" w14:cmpd="sng" w14:algn="ctr">
+                  <w14:noFill/>
+                  <w14:prstDash w14:val="solid"/>
+                  <w14:round/>
+                </w14:textOutline>
+              </w:rPr>
+            </w:pPr>
+            <w:r>
+              <w:rPr>
+                <w14:shadow w14:blurRad="38100" w14:dist="25400" w14:dir="5400000" w14:sx="100000" w14:sy="100000" w14:kx="0" w14:ky="0" w14:algn="ctr">
+                  <w14:srgbClr w14:val="6E747A">
+                    <w14:alpha w14:val="57000"/>
+                  </w14:srgbClr>
+                </w14:shadow>
+                <w14:textOutline w14:w="0" w14:cap="flat" w14:cmpd="sng" w14:algn="ctr">
+                  <w14:noFill/>
+                  <w14:prstDash w14:val="solid"/>
+                  <w14:round/>
+                </w14:textOutline>
+              </w:rPr>
+              <w:t xml:space="preserve">Access to the </w:t>
+            </w:r>
+            <w:r>
+              <w:rPr>
+                <w14:shadow w14:blurRad="38100" w14:dist="25400" w14:dir="5400000" w14:sx="100000" w14:sy="100000" w14:kx="0" w14:ky="0" w14:algn="ctr">
+                  <w14:srgbClr w14:val="6E747A">
+                    <w14:alpha w14:val="57000"/>
+                  </w14:srgbClr>
+                </w14:shadow>
+                <w14:textOutline w14:w="0" w14:cap="flat" w14:cmpd="sng" w14:algn="ctr">
+                  <w14:noFill/>
+                  <w14:prstDash w14:val="solid"/>
+                  <w14:round/>
+                </w14:textOutline>
+              </w:rPr>
+              <w:t>app</w:t>
+            </w:r>
+          </w:p>
+          <w:p>
+            <w:pPr>
+              <w:rPr>
+                <w14:shadow w14:blurRad="38100" w14:dist="25400" w14:dir="5400000" w14:sx="100000" w14:sy="100000" w14:kx="0" w14:ky="0" w14:algn="ctr">
+                  <w14:srgbClr w14:val="6E747A">
+                    <w14:alpha w14:val="57000"/>
+                  </w14:srgbClr>
+                </w14:shadow>
+                <w14:textOutline w14:w="0" w14:cap="flat" w14:cmpd="sng" w14:algn="ctr">
+                  <w14:noFill/>
+                  <w14:prstDash w14:val="solid"/>
+                  <w14:round/>
+                </w14:textOutline>
+              </w:rPr>
+            </w:pPr>
+            <w:r>
+              <w:rPr>
+                <w14:shadow w14:blurRad="38100" w14:dist="25400" w14:dir="5400000" w14:sx="100000" w14:sy="100000" w14:kx="0" w14:ky="0" w14:algn="ctr">
+                  <w14:srgbClr w14:val="6E747A">
+                    <w14:alpha w14:val="57000"/>
+                  </w14:srgbClr>
+                </w14:shadow>
+                <w14:textOutline w14:w="0" w14:cap="flat" w14:cmpd="sng" w14:algn="ctr">
+                  <w14:noFill/>
+                  <w14:prstDash w14:val="solid"/>
+                  <w14:round/>
+                </w14:textOutline>
+              </w:rPr>
+              <w:t xml:space="preserve">Computer </w:t>
+            </w:r>
+          </w:p>
+          <w:p>
+            <w:pPr>
+              <w:rPr>
+                <w14:shadow w14:blurRad="38100" w14:dist="25400" w14:dir="5400000" w14:sx="100000" w14:sy="100000" w14:kx="0" w14:ky="0" w14:algn="ctr">
+                  <w14:srgbClr w14:val="6E747A">
+                    <w14:alpha w14:val="57000"/>
+                  </w14:srgbClr>
+                </w14:shadow>
+                <w14:textOutline w14:w="0" w14:cap="flat" w14:cmpd="sng" w14:algn="ctr">
+                  <w14:noFill/>
+                  <w14:prstDash w14:val="solid"/>
+                  <w14:round/>
+                </w14:textOutline>
+              </w:rPr>
+            </w:pPr>
+            <w:r>
+              <w:rPr>
+                <w14:shadow w14:blurRad="38100" w14:dist="25400" w14:dir="5400000" w14:sx="100000" w14:sy="100000" w14:kx="0" w14:ky="0" w14:algn="ctr">
+                  <w14:srgbClr w14:val="6E747A">
+                    <w14:alpha w14:val="57000"/>
+                  </w14:srgbClr>
+                </w14:shadow>
+                <w14:textOutline w14:w="0" w14:cap="flat" w14:cmpd="sng" w14:algn="ctr">
+                  <w14:noFill/>
+                  <w14:prstDash w14:val="solid"/>
+                  <w14:round/>
+                </w14:textOutline>
+              </w:rPr>
+              <w:t xml:space="preserve">Correct username: ‘Test123’ </w:t>
+            </w:r>
+          </w:p>
+          <w:p>
+            <w:pPr>
+              <w:rPr>
+                <w14:shadow w14:blurRad="38100" w14:dist="25400" w14:dir="5400000" w14:sx="100000" w14:sy="100000" w14:kx="0" w14:ky="0" w14:algn="ctr">
+                  <w14:srgbClr w14:val="6E747A">
+                    <w14:alpha w14:val="57000"/>
+                  </w14:srgbClr>
+                </w14:shadow>
+                <w14:textOutline w14:w="0" w14:cap="flat" w14:cmpd="sng" w14:algn="ctr">
+                  <w14:noFill/>
+                  <w14:prstDash w14:val="solid"/>
+                  <w14:round/>
+                </w14:textOutline>
+              </w:rPr>
+            </w:pPr>
+            <w:r>
+              <w:rPr>
+                <w14:shadow w14:blurRad="38100" w14:dist="25400" w14:dir="5400000" w14:sx="100000" w14:sy="100000" w14:kx="0" w14:ky="0" w14:algn="ctr">
+                  <w14:srgbClr w14:val="6E747A">
+                    <w14:alpha w14:val="57000"/>
+                  </w14:srgbClr>
+                </w14:shadow>
+                <w14:textOutline w14:w="0" w14:cap="flat" w14:cmpd="sng" w14:algn="ctr">
+                  <w14:noFill/>
+                  <w14:prstDash w14:val="solid"/>
+                  <w14:round/>
+                </w14:textOutline>
+              </w:rPr>
+              <w:t>Correct password ‘admin’</w:t>
+            </w:r>
+          </w:p>
+        </w:tc>
+      </w:tr>
+      <w:tr>
+        <w:tc>
+          <w:tcPr>
+            <w:tcW w:w="4508" w:type="dxa"/>
+          </w:tcPr>
+          <w:p>
+            <w:pPr>
+              <w:rPr>
+                <w14:shadow w14:blurRad="38100" w14:dist="25400" w14:dir="5400000" w14:sx="100000" w14:sy="100000" w14:kx="0" w14:ky="0" w14:algn="ctr">
+                  <w14:srgbClr w14:val="6E747A">
+                    <w14:alpha w14:val="57000"/>
+                  </w14:srgbClr>
+                </w14:shadow>
+                <w14:textOutline w14:w="0" w14:cap="flat" w14:cmpd="sng" w14:algn="ctr">
+                  <w14:noFill/>
+                  <w14:prstDash w14:val="solid"/>
+                  <w14:round/>
+                </w14:textOutline>
+              </w:rPr>
+            </w:pPr>
+            <w:r>
+              <w:rPr>
+                <w14:shadow w14:blurRad="38100" w14:dist="25400" w14:dir="5400000" w14:sx="100000" w14:sy="100000" w14:kx="0" w14:ky="0" w14:algn="ctr">
+                  <w14:srgbClr w14:val="6E747A">
+                    <w14:alpha w14:val="57000"/>
+                  </w14:srgbClr>
+                </w14:shadow>
+                <w14:textOutline w14:w="0" w14:cap="flat" w14:cmpd="sng" w14:algn="ctr">
+                  <w14:noFill/>
+                  <w14:prstDash w14:val="solid"/>
+                  <w14:round/>
+                </w14:textOutline>
+              </w:rPr>
+              <w:t xml:space="preserve">When a button linking to a different page in the </w:t>
+            </w:r>
+          </w:p>
+          <w:p>
+            <w:pPr>
+              <w:rPr>
+                <w14:shadow w14:blurRad="38100" w14:dist="25400" w14:dir="5400000" w14:sx="100000" w14:sy="100000" w14:kx="0" w14:ky="0" w14:algn="ctr">
+                  <w14:srgbClr w14:val="6E747A">
+                    <w14:alpha w14:val="57000"/>
+                  </w14:srgbClr>
+                </w14:shadow>
+                <w14:textOutline w14:w="0" w14:cap="flat" w14:cmpd="sng" w14:algn="ctr">
+                  <w14:noFill/>
+                  <w14:prstDash w14:val="solid"/>
+                  <w14:round/>
+                </w14:textOutline>
+              </w:rPr>
+            </w:pPr>
+            <w:r>
+              <w:rPr>
+                <w14:shadow w14:blurRad="38100" w14:dist="25400" w14:dir="5400000" w14:sx="100000" w14:sy="100000" w14:kx="0" w14:ky="0" w14:algn="ctr">
+                  <w14:srgbClr w14:val="6E747A">
+                    <w14:alpha w14:val="57000"/>
+                  </w14:srgbClr>
+                </w14:shadow>
+                <w14:textOutline w14:w="0" w14:cap="flat" w14:cmpd="sng" w14:algn="ctr">
+                  <w14:noFill/>
+                  <w14:prstDash w14:val="solid"/>
+                  <w14:round/>
+                </w14:textOutline>
+              </w:rPr>
+              <w:t>dashboard is clicked the user will be redirected to that page</w:t>
+            </w:r>
+          </w:p>
+        </w:tc>
+        <w:tc>
+          <w:tcPr>
+            <w:tcW w:w="4508" w:type="dxa"/>
+          </w:tcPr>
+          <w:p>
+            <w:pPr>
+              <w:rPr>
+                <w14:shadow w14:blurRad="38100" w14:dist="25400" w14:dir="5400000" w14:sx="100000" w14:sy="100000" w14:kx="0" w14:ky="0" w14:algn="ctr">
+                  <w14:srgbClr w14:val="6E747A">
+                    <w14:alpha w14:val="57000"/>
+                  </w14:srgbClr>
+                </w14:shadow>
+                <w14:textOutline w14:w="0" w14:cap="flat" w14:cmpd="sng" w14:algn="ctr">
+                  <w14:noFill/>
+                  <w14:prstDash w14:val="solid"/>
+                  <w14:round/>
+                </w14:textOutline>
+              </w:rPr>
+            </w:pPr>
+          </w:p>
+        </w:tc>
+      </w:tr>
+    </w:tbl>
+    <w:p>
+      <w:pPr>
+        <w:rPr>
+          <w14:shadow w14:blurRad="38100" w14:dist="25400" w14:dir="5400000" w14:sx="100000" w14:sy="100000" w14:kx="0" w14:ky="0" w14:algn="ctr">
+            <w14:srgbClr w14:val="6E747A">
+              <w14:alpha w14:val="57000"/>
+            </w14:srgbClr>
+          </w14:shadow>
+          <w14:textOutline w14:w="0" w14:cap="flat" w14:cmpd="sng" w14:algn="ctr">
+            <w14:noFill/>
+            <w14:prstDash w14:val="solid"/>
+            <w14:round/>
+          </w14:textOutline>
+        </w:rPr>
+      </w:pPr>
+    </w:p>
+    <w:p>
+      <w:pPr>
+        <w:rPr>
+          <w14:shadow w14:blurRad="38100" w14:dist="25400" w14:dir="5400000" w14:sx="100000" w14:sy="100000" w14:kx="0" w14:ky="0" w14:algn="ctr">
+            <w14:srgbClr w14:val="6E747A">
+              <w14:alpha w14:val="57000"/>
+            </w14:srgbClr>
+          </w14:shadow>
+          <w14:textOutline w14:w="0" w14:cap="flat" w14:cmpd="sng" w14:algn="ctr">
+            <w14:noFill/>
+            <w14:prstDash w14:val="solid"/>
+            <w14:round/>
+          </w14:textOutline>
+        </w:rPr>
       </w:pPr>
     </w:p>
     <w:sectPr>
-      <w:headerReference w:type="even" r:id="rId14"/>
-      <w:headerReference w:type="default" r:id="rId15"/>
-      <w:footerReference w:type="even" r:id="rId16"/>
-      <w:footerReference w:type="default" r:id="rId17"/>
-      <w:headerReference w:type="first" r:id="rId18"/>
-      <w:footerReference w:type="first" r:id="rId19"/>
       <w:pgSz w:w="11906" w:h="16838"/>
       <w:pgMar w:top="1440" w:right="1440" w:bottom="1440" w:left="1440" w:header="708" w:footer="708" w:gutter="0"/>
       <w:cols w:space="708"/>
@@ -4147,36 +5483,6 @@
 </w:endnotes>
 </file>
 
-<file path=word/footer1.xml><?xml version="1.0" encoding="utf-8"?>
-<w:ftr xmlns:wpc="http://schemas.microsoft.com/office/word/2010/wordprocessingCanvas" xmlns:cx="http://schemas.microsoft.com/office/drawing/2014/chartex" xmlns:cx1="http://schemas.microsoft.com/office/drawing/2015/9/8/chartex" xmlns:cx2="http://schemas.microsoft.com/office/drawing/2015/10/21/chartex" xmlns:cx3="http://schemas.microsoft.com/office/drawing/2016/5/9/chartex" xmlns:cx4="http://schemas.microsoft.com/office/drawing/2016/5/10/chartex" xmlns:cx5="http://schemas.microsoft.com/office/drawing/2016/5/11/chartex" xmlns:cx6="http://schemas.microsoft.com/office/drawing/2016/5/12/chartex" xmlns:cx7="http://schemas.microsoft.com/office/drawing/2016/5/13/chartex" xmlns:cx8="http://schemas.microsoft.com/office/drawing/2016/5/14/chartex" xmlns:mc="http://schemas.openxmlformats.org/markup-compatibility/2006" xmlns:aink="http://schemas.microsoft.com/office/drawing/2016/ink" xmlns:am3d="http://schemas.microsoft.com/office/drawing/2017/model3d" xmlns:o="urn:schemas-microsoft-com:office:office" xmlns:r="http://schemas.openxmlformats.org/officeDocument/2006/relationships" xmlns:m="http://schemas.openxmlformats.org/officeDocument/2006/math" xmlns:v="urn:schemas-microsoft-com:vml" xmlns:wp14="http://schemas.microsoft.com/office/word/2010/wordprocessingDrawing" xmlns:wp="http://schemas.openxmlformats.org/drawingml/2006/wordprocessingDrawing" xmlns:w10="urn:schemas-microsoft-com:office:word" xmlns:w="http://schemas.openxmlformats.org/wordprocessingml/2006/main" xmlns:w14="http://schemas.microsoft.com/office/word/2010/wordml" xmlns:w15="http://schemas.microsoft.com/office/word/2012/wordml" xmlns:w16cex="http://schemas.microsoft.com/office/word/2018/wordml/cex" xmlns:w16cid="http://schemas.microsoft.com/office/word/2016/wordml/cid" xmlns:w16="http://schemas.microsoft.com/office/word/2018/wordml" xmlns:w16sdtdh="http://schemas.microsoft.com/office/word/2020/wordml/sdtdatahash" xmlns:w16se="http://schemas.microsoft.com/office/word/2015/wordml/symex" xmlns:wpg="http://schemas.microsoft.com/office/word/2010/wordprocessingGroup" xmlns:wpi="http://schemas.microsoft.com/office/word/2010/wordprocessingInk" xmlns:wne="http://schemas.microsoft.com/office/word/2006/wordml" xmlns:wps="http://schemas.microsoft.com/office/word/2010/wordprocessingShape" mc:Ignorable="w14 w15 w16se w16cid w16 w16cex w16sdtdh wp14">
-  <w:p>
-    <w:pPr>
-      <w:pStyle w:val="Footer"/>
-    </w:pPr>
-  </w:p>
-</w:ftr>
-</file>
-
-<file path=word/footer2.xml><?xml version="1.0" encoding="utf-8"?>
-<w:ftr xmlns:wpc="http://schemas.microsoft.com/office/word/2010/wordprocessingCanvas" xmlns:cx="http://schemas.microsoft.com/office/drawing/2014/chartex" xmlns:cx1="http://schemas.microsoft.com/office/drawing/2015/9/8/chartex" xmlns:cx2="http://schemas.microsoft.com/office/drawing/2015/10/21/chartex" xmlns:cx3="http://schemas.microsoft.com/office/drawing/2016/5/9/chartex" xmlns:cx4="http://schemas.microsoft.com/office/drawing/2016/5/10/chartex" xmlns:cx5="http://schemas.microsoft.com/office/drawing/2016/5/11/chartex" xmlns:cx6="http://schemas.microsoft.com/office/drawing/2016/5/12/chartex" xmlns:cx7="http://schemas.microsoft.com/office/drawing/2016/5/13/chartex" xmlns:cx8="http://schemas.microsoft.com/office/drawing/2016/5/14/chartex" xmlns:mc="http://schemas.openxmlformats.org/markup-compatibility/2006" xmlns:aink="http://schemas.microsoft.com/office/drawing/2016/ink" xmlns:am3d="http://schemas.microsoft.com/office/drawing/2017/model3d" xmlns:o="urn:schemas-microsoft-com:office:office" xmlns:r="http://schemas.openxmlformats.org/officeDocument/2006/relationships" xmlns:m="http://schemas.openxmlformats.org/officeDocument/2006/math" xmlns:v="urn:schemas-microsoft-com:vml" xmlns:wp14="http://schemas.microsoft.com/office/word/2010/wordprocessingDrawing" xmlns:wp="http://schemas.openxmlformats.org/drawingml/2006/wordprocessingDrawing" xmlns:w10="urn:schemas-microsoft-com:office:word" xmlns:w="http://schemas.openxmlformats.org/wordprocessingml/2006/main" xmlns:w14="http://schemas.microsoft.com/office/word/2010/wordml" xmlns:w15="http://schemas.microsoft.com/office/word/2012/wordml" xmlns:w16cex="http://schemas.microsoft.com/office/word/2018/wordml/cex" xmlns:w16cid="http://schemas.microsoft.com/office/word/2016/wordml/cid" xmlns:w16="http://schemas.microsoft.com/office/word/2018/wordml" xmlns:w16sdtdh="http://schemas.microsoft.com/office/word/2020/wordml/sdtdatahash" xmlns:w16se="http://schemas.microsoft.com/office/word/2015/wordml/symex" xmlns:wpg="http://schemas.microsoft.com/office/word/2010/wordprocessingGroup" xmlns:wpi="http://schemas.microsoft.com/office/word/2010/wordprocessingInk" xmlns:wne="http://schemas.microsoft.com/office/word/2006/wordml" xmlns:wps="http://schemas.microsoft.com/office/word/2010/wordprocessingShape" mc:Ignorable="w14 w15 w16se w16cid w16 w16cex w16sdtdh wp14">
-  <w:p>
-    <w:pPr>
-      <w:pStyle w:val="Footer"/>
-    </w:pPr>
-  </w:p>
-</w:ftr>
-</file>
-
-<file path=word/footer3.xml><?xml version="1.0" encoding="utf-8"?>
-<w:ftr xmlns:wpc="http://schemas.microsoft.com/office/word/2010/wordprocessingCanvas" xmlns:cx="http://schemas.microsoft.com/office/drawing/2014/chartex" xmlns:cx1="http://schemas.microsoft.com/office/drawing/2015/9/8/chartex" xmlns:cx2="http://schemas.microsoft.com/office/drawing/2015/10/21/chartex" xmlns:cx3="http://schemas.microsoft.com/office/drawing/2016/5/9/chartex" xmlns:cx4="http://schemas.microsoft.com/office/drawing/2016/5/10/chartex" xmlns:cx5="http://schemas.microsoft.com/office/drawing/2016/5/11/chartex" xmlns:cx6="http://schemas.microsoft.com/office/drawing/2016/5/12/chartex" xmlns:cx7="http://schemas.microsoft.com/office/drawing/2016/5/13/chartex" xmlns:cx8="http://schemas.microsoft.com/office/drawing/2016/5/14/chartex" xmlns:mc="http://schemas.openxmlformats.org/markup-compatibility/2006" xmlns:aink="http://schemas.microsoft.com/office/drawing/2016/ink" xmlns:am3d="http://schemas.microsoft.com/office/drawing/2017/model3d" xmlns:o="urn:schemas-microsoft-com:office:office" xmlns:r="http://schemas.openxmlformats.org/officeDocument/2006/relationships" xmlns:m="http://schemas.openxmlformats.org/officeDocument/2006/math" xmlns:v="urn:schemas-microsoft-com:vml" xmlns:wp14="http://schemas.microsoft.com/office/word/2010/wordprocessingDrawing" xmlns:wp="http://schemas.openxmlformats.org/drawingml/2006/wordprocessingDrawing" xmlns:w10="urn:schemas-microsoft-com:office:word" xmlns:w="http://schemas.openxmlformats.org/wordprocessingml/2006/main" xmlns:w14="http://schemas.microsoft.com/office/word/2010/wordml" xmlns:w15="http://schemas.microsoft.com/office/word/2012/wordml" xmlns:w16cex="http://schemas.microsoft.com/office/word/2018/wordml/cex" xmlns:w16cid="http://schemas.microsoft.com/office/word/2016/wordml/cid" xmlns:w16="http://schemas.microsoft.com/office/word/2018/wordml" xmlns:w16sdtdh="http://schemas.microsoft.com/office/word/2020/wordml/sdtdatahash" xmlns:w16se="http://schemas.microsoft.com/office/word/2015/wordml/symex" xmlns:wpg="http://schemas.microsoft.com/office/word/2010/wordprocessingGroup" xmlns:wpi="http://schemas.microsoft.com/office/word/2010/wordprocessingInk" xmlns:wne="http://schemas.microsoft.com/office/word/2006/wordml" xmlns:wps="http://schemas.microsoft.com/office/word/2010/wordprocessingShape" mc:Ignorable="w14 w15 w16se w16cid w16 w16cex w16sdtdh wp14">
-  <w:p>
-    <w:pPr>
-      <w:pStyle w:val="Footer"/>
-    </w:pPr>
-  </w:p>
-</w:ftr>
-</file>
-
 <file path=word/footnotes.xml><?xml version="1.0" encoding="utf-8"?>
 <w:footnotes xmlns:wpc="http://schemas.microsoft.com/office/word/2010/wordprocessingCanvas" xmlns:cx="http://schemas.microsoft.com/office/drawing/2014/chartex" xmlns:cx1="http://schemas.microsoft.com/office/drawing/2015/9/8/chartex" xmlns:cx2="http://schemas.microsoft.com/office/drawing/2015/10/21/chartex" xmlns:cx3="http://schemas.microsoft.com/office/drawing/2016/5/9/chartex" xmlns:cx4="http://schemas.microsoft.com/office/drawing/2016/5/10/chartex" xmlns:cx5="http://schemas.microsoft.com/office/drawing/2016/5/11/chartex" xmlns:cx6="http://schemas.microsoft.com/office/drawing/2016/5/12/chartex" xmlns:cx7="http://schemas.microsoft.com/office/drawing/2016/5/13/chartex" xmlns:cx8="http://schemas.microsoft.com/office/drawing/2016/5/14/chartex" xmlns:mc="http://schemas.openxmlformats.org/markup-compatibility/2006" xmlns:aink="http://schemas.microsoft.com/office/drawing/2016/ink" xmlns:am3d="http://schemas.microsoft.com/office/drawing/2017/model3d" xmlns:o="urn:schemas-microsoft-com:office:office" xmlns:r="http://schemas.openxmlformats.org/officeDocument/2006/relationships" xmlns:m="http://schemas.openxmlformats.org/officeDocument/2006/math" xmlns:v="urn:schemas-microsoft-com:vml" xmlns:wp14="http://schemas.microsoft.com/office/word/2010/wordprocessingDrawing" xmlns:wp="http://schemas.openxmlformats.org/drawingml/2006/wordprocessingDrawing" xmlns:w10="urn:schemas-microsoft-com:office:word" xmlns:w="http://schemas.openxmlformats.org/wordprocessingml/2006/main" xmlns:w14="http://schemas.microsoft.com/office/word/2010/wordml" xmlns:w15="http://schemas.microsoft.com/office/word/2012/wordml" xmlns:w16cex="http://schemas.microsoft.com/office/word/2018/wordml/cex" xmlns:w16cid="http://schemas.microsoft.com/office/word/2016/wordml/cid" xmlns:w16="http://schemas.microsoft.com/office/word/2018/wordml" xmlns:w16sdtdh="http://schemas.microsoft.com/office/word/2020/wordml/sdtdatahash" xmlns:w16se="http://schemas.microsoft.com/office/word/2015/wordml/symex" xmlns:wpg="http://schemas.microsoft.com/office/word/2010/wordprocessingGroup" xmlns:wpi="http://schemas.microsoft.com/office/word/2010/wordprocessingInk" xmlns:wne="http://schemas.microsoft.com/office/word/2006/wordml" xmlns:wps="http://schemas.microsoft.com/office/word/2010/wordprocessingShape" mc:Ignorable="w14 w15 w16se w16cid w16 w16cex w16sdtdh wp14">
   <w:footnote w:type="separator" w:id="-1">
@@ -4200,36 +5506,6 @@
     </w:p>
   </w:footnote>
 </w:footnotes>
-</file>
-
-<file path=word/header1.xml><?xml version="1.0" encoding="utf-8"?>
-<w:hdr xmlns:wpc="http://schemas.microsoft.com/office/word/2010/wordprocessingCanvas" xmlns:cx="http://schemas.microsoft.com/office/drawing/2014/chartex" xmlns:cx1="http://schemas.microsoft.com/office/drawing/2015/9/8/chartex" xmlns:cx2="http://schemas.microsoft.com/office/drawing/2015/10/21/chartex" xmlns:cx3="http://schemas.microsoft.com/office/drawing/2016/5/9/chartex" xmlns:cx4="http://schemas.microsoft.com/office/drawing/2016/5/10/chartex" xmlns:cx5="http://schemas.microsoft.com/office/drawing/2016/5/11/chartex" xmlns:cx6="http://schemas.microsoft.com/office/drawing/2016/5/12/chartex" xmlns:cx7="http://schemas.microsoft.com/office/drawing/2016/5/13/chartex" xmlns:cx8="http://schemas.microsoft.com/office/drawing/2016/5/14/chartex" xmlns:mc="http://schemas.openxmlformats.org/markup-compatibility/2006" xmlns:aink="http://schemas.microsoft.com/office/drawing/2016/ink" xmlns:am3d="http://schemas.microsoft.com/office/drawing/2017/model3d" xmlns:o="urn:schemas-microsoft-com:office:office" xmlns:r="http://schemas.openxmlformats.org/officeDocument/2006/relationships" xmlns:m="http://schemas.openxmlformats.org/officeDocument/2006/math" xmlns:v="urn:schemas-microsoft-com:vml" xmlns:wp14="http://schemas.microsoft.com/office/word/2010/wordprocessingDrawing" xmlns:wp="http://schemas.openxmlformats.org/drawingml/2006/wordprocessingDrawing" xmlns:w10="urn:schemas-microsoft-com:office:word" xmlns:w="http://schemas.openxmlformats.org/wordprocessingml/2006/main" xmlns:w14="http://schemas.microsoft.com/office/word/2010/wordml" xmlns:w15="http://schemas.microsoft.com/office/word/2012/wordml" xmlns:w16cex="http://schemas.microsoft.com/office/word/2018/wordml/cex" xmlns:w16cid="http://schemas.microsoft.com/office/word/2016/wordml/cid" xmlns:w16="http://schemas.microsoft.com/office/word/2018/wordml" xmlns:w16sdtdh="http://schemas.microsoft.com/office/word/2020/wordml/sdtdatahash" xmlns:w16se="http://schemas.microsoft.com/office/word/2015/wordml/symex" xmlns:wpg="http://schemas.microsoft.com/office/word/2010/wordprocessingGroup" xmlns:wpi="http://schemas.microsoft.com/office/word/2010/wordprocessingInk" xmlns:wne="http://schemas.microsoft.com/office/word/2006/wordml" xmlns:wps="http://schemas.microsoft.com/office/word/2010/wordprocessingShape" mc:Ignorable="w14 w15 w16se w16cid w16 w16cex w16sdtdh wp14">
-  <w:p>
-    <w:pPr>
-      <w:pStyle w:val="Header"/>
-    </w:pPr>
-  </w:p>
-</w:hdr>
-</file>
-
-<file path=word/header2.xml><?xml version="1.0" encoding="utf-8"?>
-<w:hdr xmlns:wpc="http://schemas.microsoft.com/office/word/2010/wordprocessingCanvas" xmlns:cx="http://schemas.microsoft.com/office/drawing/2014/chartex" xmlns:cx1="http://schemas.microsoft.com/office/drawing/2015/9/8/chartex" xmlns:cx2="http://schemas.microsoft.com/office/drawing/2015/10/21/chartex" xmlns:cx3="http://schemas.microsoft.com/office/drawing/2016/5/9/chartex" xmlns:cx4="http://schemas.microsoft.com/office/drawing/2016/5/10/chartex" xmlns:cx5="http://schemas.microsoft.com/office/drawing/2016/5/11/chartex" xmlns:cx6="http://schemas.microsoft.com/office/drawing/2016/5/12/chartex" xmlns:cx7="http://schemas.microsoft.com/office/drawing/2016/5/13/chartex" xmlns:cx8="http://schemas.microsoft.com/office/drawing/2016/5/14/chartex" xmlns:mc="http://schemas.openxmlformats.org/markup-compatibility/2006" xmlns:aink="http://schemas.microsoft.com/office/drawing/2016/ink" xmlns:am3d="http://schemas.microsoft.com/office/drawing/2017/model3d" xmlns:o="urn:schemas-microsoft-com:office:office" xmlns:r="http://schemas.openxmlformats.org/officeDocument/2006/relationships" xmlns:m="http://schemas.openxmlformats.org/officeDocument/2006/math" xmlns:v="urn:schemas-microsoft-com:vml" xmlns:wp14="http://schemas.microsoft.com/office/word/2010/wordprocessingDrawing" xmlns:wp="http://schemas.openxmlformats.org/drawingml/2006/wordprocessingDrawing" xmlns:w10="urn:schemas-microsoft-com:office:word" xmlns:w="http://schemas.openxmlformats.org/wordprocessingml/2006/main" xmlns:w14="http://schemas.microsoft.com/office/word/2010/wordml" xmlns:w15="http://schemas.microsoft.com/office/word/2012/wordml" xmlns:w16cex="http://schemas.microsoft.com/office/word/2018/wordml/cex" xmlns:w16cid="http://schemas.microsoft.com/office/word/2016/wordml/cid" xmlns:w16="http://schemas.microsoft.com/office/word/2018/wordml" xmlns:w16sdtdh="http://schemas.microsoft.com/office/word/2020/wordml/sdtdatahash" xmlns:w16se="http://schemas.microsoft.com/office/word/2015/wordml/symex" xmlns:wpg="http://schemas.microsoft.com/office/word/2010/wordprocessingGroup" xmlns:wpi="http://schemas.microsoft.com/office/word/2010/wordprocessingInk" xmlns:wne="http://schemas.microsoft.com/office/word/2006/wordml" xmlns:wps="http://schemas.microsoft.com/office/word/2010/wordprocessingShape" mc:Ignorable="w14 w15 w16se w16cid w16 w16cex w16sdtdh wp14">
-  <w:p>
-    <w:pPr>
-      <w:pStyle w:val="Header"/>
-    </w:pPr>
-  </w:p>
-</w:hdr>
-</file>
-
-<file path=word/header3.xml><?xml version="1.0" encoding="utf-8"?>
-<w:hdr xmlns:wpc="http://schemas.microsoft.com/office/word/2010/wordprocessingCanvas" xmlns:cx="http://schemas.microsoft.com/office/drawing/2014/chartex" xmlns:cx1="http://schemas.microsoft.com/office/drawing/2015/9/8/chartex" xmlns:cx2="http://schemas.microsoft.com/office/drawing/2015/10/21/chartex" xmlns:cx3="http://schemas.microsoft.com/office/drawing/2016/5/9/chartex" xmlns:cx4="http://schemas.microsoft.com/office/drawing/2016/5/10/chartex" xmlns:cx5="http://schemas.microsoft.com/office/drawing/2016/5/11/chartex" xmlns:cx6="http://schemas.microsoft.com/office/drawing/2016/5/12/chartex" xmlns:cx7="http://schemas.microsoft.com/office/drawing/2016/5/13/chartex" xmlns:cx8="http://schemas.microsoft.com/office/drawing/2016/5/14/chartex" xmlns:mc="http://schemas.openxmlformats.org/markup-compatibility/2006" xmlns:aink="http://schemas.microsoft.com/office/drawing/2016/ink" xmlns:am3d="http://schemas.microsoft.com/office/drawing/2017/model3d" xmlns:o="urn:schemas-microsoft-com:office:office" xmlns:r="http://schemas.openxmlformats.org/officeDocument/2006/relationships" xmlns:m="http://schemas.openxmlformats.org/officeDocument/2006/math" xmlns:v="urn:schemas-microsoft-com:vml" xmlns:wp14="http://schemas.microsoft.com/office/word/2010/wordprocessingDrawing" xmlns:wp="http://schemas.openxmlformats.org/drawingml/2006/wordprocessingDrawing" xmlns:w10="urn:schemas-microsoft-com:office:word" xmlns:w="http://schemas.openxmlformats.org/wordprocessingml/2006/main" xmlns:w14="http://schemas.microsoft.com/office/word/2010/wordml" xmlns:w15="http://schemas.microsoft.com/office/word/2012/wordml" xmlns:w16cex="http://schemas.microsoft.com/office/word/2018/wordml/cex" xmlns:w16cid="http://schemas.microsoft.com/office/word/2016/wordml/cid" xmlns:w16="http://schemas.microsoft.com/office/word/2018/wordml" xmlns:w16sdtdh="http://schemas.microsoft.com/office/word/2020/wordml/sdtdatahash" xmlns:w16se="http://schemas.microsoft.com/office/word/2015/wordml/symex" xmlns:wpg="http://schemas.microsoft.com/office/word/2010/wordprocessingGroup" xmlns:wpi="http://schemas.microsoft.com/office/word/2010/wordprocessingInk" xmlns:wne="http://schemas.microsoft.com/office/word/2006/wordml" xmlns:wps="http://schemas.microsoft.com/office/word/2010/wordprocessingShape" mc:Ignorable="w14 w15 w16se w16cid w16 w16cex w16sdtdh wp14">
-  <w:p>
-    <w:pPr>
-      <w:pStyle w:val="Header"/>
-    </w:pPr>
-  </w:p>
-</w:hdr>
 </file>
 
 <file path=word/styles.xml><?xml version="1.0" encoding="utf-8"?>

</xml_diff>